<commit_message>
Add mysql code to report
</commit_message>
<xml_diff>
--- a/Lab8/Lab8_Kyrychenko.docx
+++ b/Lab8/Lab8_Kyrychenko.docx
@@ -675,23 +675,13 @@
         </w:rPr>
         <w:tab/>
       </w:r>
-      <w:proofErr w:type="spellStart"/>
-      <w:r>
-        <w:rPr>
-          <w:sz w:val="28"/>
-          <w:szCs w:val="28"/>
-          <w:lang w:val="uk-UA"/>
-        </w:rPr>
-        <w:t>Парфененко</w:t>
-      </w:r>
-      <w:proofErr w:type="spellEnd"/>
-      <w:r>
-        <w:rPr>
-          <w:sz w:val="28"/>
-          <w:szCs w:val="28"/>
-          <w:lang w:val="uk-UA"/>
-        </w:rPr>
-        <w:t xml:space="preserve"> Ю.В.</w:t>
+      <w:r>
+        <w:rPr>
+          <w:sz w:val="28"/>
+          <w:szCs w:val="28"/>
+          <w:lang w:val="uk-UA"/>
+        </w:rPr>
+        <w:t>Парфененко Ю.В.</w:t>
       </w:r>
     </w:p>
     <w:p>
@@ -895,313 +885,110 @@
         </w:rPr>
         <w:t xml:space="preserve"> </w:t>
       </w:r>
-      <w:proofErr w:type="spellStart"/>
-      <w:r>
-        <w:rPr>
-          <w:sz w:val="28"/>
-          <w:szCs w:val="28"/>
-        </w:rPr>
-        <w:t>Використання</w:t>
-      </w:r>
-      <w:proofErr w:type="spellEnd"/>
-      <w:r>
-        <w:rPr>
-          <w:sz w:val="28"/>
-          <w:szCs w:val="28"/>
+      <w:r>
+        <w:rPr>
+          <w:sz w:val="28"/>
+          <w:szCs w:val="28"/>
+        </w:rPr>
+        <w:t>Використання патерну MVC у веб-розробці</w:t>
+      </w:r>
+    </w:p>
+    <w:p>
+      <w:pPr>
+        <w:rPr>
+          <w:sz w:val="28"/>
+          <w:szCs w:val="28"/>
+          <w:lang w:val="uk-UA"/>
+        </w:rPr>
+      </w:pPr>
+    </w:p>
+    <w:p>
+      <w:pPr>
+        <w:ind w:firstLine="0"/>
+        <w:rPr>
+          <w:b/>
+          <w:bCs/>
+          <w:sz w:val="28"/>
+          <w:szCs w:val="28"/>
+          <w:lang w:val="en-US"/>
+        </w:rPr>
+      </w:pPr>
+      <w:r>
+        <w:rPr>
+          <w:b/>
+          <w:bCs/>
+          <w:sz w:val="28"/>
+          <w:szCs w:val="28"/>
+          <w:lang w:val="uk-UA"/>
+        </w:rPr>
+        <w:t>Варіант 8</w:t>
+      </w:r>
+    </w:p>
+    <w:p>
+      <w:pPr>
+        <w:ind w:firstLine="0"/>
+        <w:rPr>
+          <w:b/>
+          <w:bCs/>
+          <w:sz w:val="28"/>
+          <w:szCs w:val="28"/>
+          <w:lang w:val="en-US"/>
+        </w:rPr>
+      </w:pPr>
+    </w:p>
+    <w:p>
+      <w:pPr>
+        <w:ind w:firstLine="0"/>
+        <w:rPr>
+          <w:sz w:val="28"/>
+          <w:szCs w:val="28"/>
+          <w:lang w:val="uk-UA"/>
+        </w:rPr>
+      </w:pPr>
+      <w:r>
+        <w:rPr>
+          <w:b/>
+          <w:bCs/>
+          <w:sz w:val="28"/>
+          <w:szCs w:val="28"/>
+          <w:lang w:val="uk-UA"/>
+        </w:rPr>
+        <w:t xml:space="preserve">Завдання </w:t>
+      </w:r>
+      <w:r>
+        <w:rPr>
+          <w:b/>
+          <w:bCs/>
+          <w:sz w:val="28"/>
+          <w:szCs w:val="28"/>
+          <w:lang w:val="en-US"/>
+        </w:rPr>
+        <w:t>1</w:t>
+      </w:r>
+      <w:r>
+        <w:rPr>
+          <w:b/>
+          <w:bCs/>
+          <w:sz w:val="28"/>
+          <w:szCs w:val="28"/>
+          <w:lang w:val="uk-UA"/>
+        </w:rPr>
+        <w:t>.</w:t>
+      </w:r>
+      <w:r>
+        <w:rPr>
+          <w:sz w:val="28"/>
+          <w:szCs w:val="28"/>
+          <w:lang w:val="uk-UA"/>
         </w:rPr>
         <w:t xml:space="preserve"> </w:t>
       </w:r>
-      <w:proofErr w:type="spellStart"/>
-      <w:r>
-        <w:rPr>
-          <w:sz w:val="28"/>
-          <w:szCs w:val="28"/>
-        </w:rPr>
-        <w:t>патерну</w:t>
-      </w:r>
-      <w:proofErr w:type="spellEnd"/>
-      <w:r>
-        <w:rPr>
-          <w:sz w:val="28"/>
-          <w:szCs w:val="28"/>
-        </w:rPr>
-        <w:t xml:space="preserve"> MVC у веб-</w:t>
-      </w:r>
-      <w:proofErr w:type="spellStart"/>
-      <w:r>
-        <w:rPr>
-          <w:sz w:val="28"/>
-          <w:szCs w:val="28"/>
-        </w:rPr>
-        <w:t>розробці</w:t>
-      </w:r>
-      <w:proofErr w:type="spellEnd"/>
-    </w:p>
-    <w:p>
-      <w:pPr>
-        <w:rPr>
-          <w:sz w:val="28"/>
-          <w:szCs w:val="28"/>
-          <w:lang w:val="uk-UA"/>
-        </w:rPr>
-      </w:pPr>
-    </w:p>
-    <w:p>
-      <w:pPr>
-        <w:ind w:firstLine="0"/>
-        <w:rPr>
-          <w:b/>
-          <w:bCs/>
-          <w:sz w:val="28"/>
-          <w:szCs w:val="28"/>
-          <w:lang w:val="en-US"/>
-        </w:rPr>
-      </w:pPr>
-      <w:r>
-        <w:rPr>
-          <w:b/>
-          <w:bCs/>
-          <w:sz w:val="28"/>
-          <w:szCs w:val="28"/>
-          <w:lang w:val="uk-UA"/>
-        </w:rPr>
-        <w:t>Варіант 8</w:t>
-      </w:r>
-    </w:p>
-    <w:p>
-      <w:pPr>
-        <w:ind w:firstLine="0"/>
-        <w:rPr>
-          <w:b/>
-          <w:bCs/>
-          <w:sz w:val="28"/>
-          <w:szCs w:val="28"/>
-          <w:lang w:val="en-US"/>
-        </w:rPr>
-      </w:pPr>
-    </w:p>
-    <w:p>
-      <w:pPr>
-        <w:ind w:firstLine="0"/>
-        <w:rPr>
-          <w:sz w:val="28"/>
-          <w:szCs w:val="28"/>
-          <w:lang w:val="uk-UA"/>
-        </w:rPr>
-      </w:pPr>
-      <w:r>
-        <w:rPr>
-          <w:b/>
-          <w:bCs/>
-          <w:sz w:val="28"/>
-          <w:szCs w:val="28"/>
-          <w:lang w:val="uk-UA"/>
-        </w:rPr>
-        <w:t xml:space="preserve">Завдання </w:t>
-      </w:r>
-      <w:r>
-        <w:rPr>
-          <w:b/>
-          <w:bCs/>
-          <w:sz w:val="28"/>
-          <w:szCs w:val="28"/>
-          <w:lang w:val="en-US"/>
-        </w:rPr>
-        <w:t>1</w:t>
-      </w:r>
-      <w:r>
-        <w:rPr>
-          <w:b/>
-          <w:bCs/>
-          <w:sz w:val="28"/>
-          <w:szCs w:val="28"/>
-          <w:lang w:val="uk-UA"/>
-        </w:rPr>
-        <w:t>.</w:t>
-      </w:r>
-      <w:r>
-        <w:rPr>
-          <w:sz w:val="28"/>
-          <w:szCs w:val="28"/>
-          <w:lang w:val="uk-UA"/>
-        </w:rPr>
-        <w:t xml:space="preserve"> </w:t>
-      </w:r>
-      <w:proofErr w:type="spellStart"/>
-      <w:r>
-        <w:rPr>
-          <w:sz w:val="28"/>
-          <w:szCs w:val="28"/>
-        </w:rPr>
-        <w:t>Реалізуйте</w:t>
-      </w:r>
-      <w:proofErr w:type="spellEnd"/>
-      <w:r>
-        <w:rPr>
-          <w:sz w:val="28"/>
-          <w:szCs w:val="28"/>
-        </w:rPr>
-        <w:t xml:space="preserve"> </w:t>
-      </w:r>
-      <w:proofErr w:type="spellStart"/>
-      <w:r>
-        <w:rPr>
-          <w:sz w:val="28"/>
-          <w:szCs w:val="28"/>
-        </w:rPr>
-        <w:t>патерн</w:t>
-      </w:r>
-      <w:proofErr w:type="spellEnd"/>
-      <w:r>
-        <w:rPr>
-          <w:sz w:val="28"/>
-          <w:szCs w:val="28"/>
-        </w:rPr>
-        <w:t xml:space="preserve"> MVC на </w:t>
-      </w:r>
-      <w:proofErr w:type="spellStart"/>
-      <w:r>
-        <w:rPr>
-          <w:sz w:val="28"/>
-          <w:szCs w:val="28"/>
-        </w:rPr>
-        <w:t>прикладі</w:t>
-      </w:r>
-      <w:proofErr w:type="spellEnd"/>
-      <w:r>
-        <w:rPr>
-          <w:sz w:val="28"/>
-          <w:szCs w:val="28"/>
-        </w:rPr>
-        <w:t xml:space="preserve"> </w:t>
-      </w:r>
-      <w:proofErr w:type="spellStart"/>
-      <w:r>
-        <w:rPr>
-          <w:sz w:val="28"/>
-          <w:szCs w:val="28"/>
-        </w:rPr>
-        <w:t>програми</w:t>
-      </w:r>
-      <w:proofErr w:type="spellEnd"/>
-      <w:r>
-        <w:rPr>
-          <w:sz w:val="28"/>
-          <w:szCs w:val="28"/>
-        </w:rPr>
-        <w:t xml:space="preserve"> перегляду </w:t>
-      </w:r>
-      <w:proofErr w:type="spellStart"/>
-      <w:r>
-        <w:rPr>
-          <w:sz w:val="28"/>
-          <w:szCs w:val="28"/>
-        </w:rPr>
-        <w:t>інформації</w:t>
-      </w:r>
-      <w:proofErr w:type="spellEnd"/>
-      <w:r>
-        <w:rPr>
-          <w:sz w:val="28"/>
-          <w:szCs w:val="28"/>
-        </w:rPr>
-        <w:t xml:space="preserve"> про книги. Схему </w:t>
-      </w:r>
-      <w:proofErr w:type="spellStart"/>
-      <w:r>
-        <w:rPr>
-          <w:sz w:val="28"/>
-          <w:szCs w:val="28"/>
-        </w:rPr>
-        <w:t>взаємодії</w:t>
-      </w:r>
-      <w:proofErr w:type="spellEnd"/>
-      <w:r>
-        <w:rPr>
-          <w:sz w:val="28"/>
-          <w:szCs w:val="28"/>
-        </w:rPr>
-        <w:t xml:space="preserve"> </w:t>
-      </w:r>
-      <w:proofErr w:type="spellStart"/>
-      <w:r>
-        <w:rPr>
-          <w:sz w:val="28"/>
-          <w:szCs w:val="28"/>
-        </w:rPr>
-        <w:t>компонентів</w:t>
-      </w:r>
-      <w:proofErr w:type="spellEnd"/>
-      <w:r>
-        <w:rPr>
-          <w:sz w:val="28"/>
-          <w:szCs w:val="28"/>
-        </w:rPr>
-        <w:t xml:space="preserve"> </w:t>
-      </w:r>
-      <w:proofErr w:type="spellStart"/>
-      <w:r>
-        <w:rPr>
-          <w:sz w:val="28"/>
-          <w:szCs w:val="28"/>
-        </w:rPr>
-        <w:t>патерну</w:t>
-      </w:r>
-      <w:proofErr w:type="spellEnd"/>
-      <w:r>
-        <w:rPr>
-          <w:sz w:val="28"/>
-          <w:szCs w:val="28"/>
-        </w:rPr>
-        <w:t xml:space="preserve"> MVC </w:t>
-      </w:r>
-      <w:proofErr w:type="spellStart"/>
-      <w:r>
-        <w:rPr>
-          <w:sz w:val="28"/>
-          <w:szCs w:val="28"/>
-        </w:rPr>
-        <w:t>між</w:t>
-      </w:r>
-      <w:proofErr w:type="spellEnd"/>
-      <w:r>
-        <w:rPr>
-          <w:sz w:val="28"/>
-          <w:szCs w:val="28"/>
-        </w:rPr>
-        <w:t xml:space="preserve"> собою та з </w:t>
-      </w:r>
-      <w:proofErr w:type="spellStart"/>
-      <w:r>
-        <w:rPr>
-          <w:sz w:val="28"/>
-          <w:szCs w:val="28"/>
-        </w:rPr>
-        <w:t>клієнтом</w:t>
-      </w:r>
-      <w:proofErr w:type="spellEnd"/>
-      <w:r>
-        <w:rPr>
-          <w:sz w:val="28"/>
-          <w:szCs w:val="28"/>
-        </w:rPr>
-        <w:t xml:space="preserve"> </w:t>
-      </w:r>
-      <w:proofErr w:type="spellStart"/>
-      <w:r>
-        <w:rPr>
-          <w:sz w:val="28"/>
-          <w:szCs w:val="28"/>
-        </w:rPr>
-        <w:t>зображено</w:t>
-      </w:r>
-      <w:proofErr w:type="spellEnd"/>
-      <w:r>
-        <w:rPr>
-          <w:sz w:val="28"/>
-          <w:szCs w:val="28"/>
-        </w:rPr>
-        <w:t xml:space="preserve"> на рис.1.  </w:t>
+      <w:r>
+        <w:rPr>
+          <w:sz w:val="28"/>
+          <w:szCs w:val="28"/>
+        </w:rPr>
+        <w:t>Реалізуйте патерн MVC на прикладі програми перегляду інформації про книги. Схему взаємодії компонентів патерну MVC між собою та з клієнтом зображено на рис.1.  </w:t>
       </w:r>
     </w:p>
     <w:p>
@@ -1321,7 +1108,6 @@
         </w:rPr>
         <w:t xml:space="preserve">Програмний код ФАЙЛ </w:t>
       </w:r>
-      <w:proofErr w:type="spellStart"/>
       <w:r>
         <w:rPr>
           <w:b/>
@@ -1332,7 +1118,6 @@
         </w:rPr>
         <w:t>Controller.php</w:t>
       </w:r>
-      <w:proofErr w:type="spellEnd"/>
     </w:p>
     <w:p>
       <w:pPr>
@@ -1350,61 +1135,16 @@
           <w:szCs w:val="28"/>
           <w:lang w:val="en-US"/>
         </w:rPr>
-        <w:t>&lt;?</w:t>
-      </w:r>
-      <w:proofErr w:type="spellStart"/>
-      <w:r>
-        <w:rPr>
-          <w:sz w:val="28"/>
-          <w:szCs w:val="28"/>
-          <w:lang w:val="en-US"/>
-        </w:rPr>
-        <w:t>php</w:t>
-      </w:r>
-      <w:proofErr w:type="spellEnd"/>
-      <w:r>
-        <w:rPr>
-          <w:sz w:val="28"/>
-          <w:szCs w:val="28"/>
-          <w:lang w:val="en-US"/>
-        </w:rPr>
-        <w:br/>
-      </w:r>
-      <w:proofErr w:type="spellStart"/>
-      <w:r>
-        <w:rPr>
-          <w:sz w:val="28"/>
-          <w:szCs w:val="28"/>
-          <w:lang w:val="en-US"/>
-        </w:rPr>
-        <w:t>include_once</w:t>
-      </w:r>
-      <w:proofErr w:type="spellEnd"/>
-      <w:r>
-        <w:rPr>
-          <w:sz w:val="28"/>
-          <w:szCs w:val="28"/>
-          <w:lang w:val="en-US"/>
-        </w:rPr>
-        <w:t>("model/</w:t>
-      </w:r>
-      <w:proofErr w:type="spellStart"/>
-      <w:r>
-        <w:rPr>
-          <w:sz w:val="28"/>
-          <w:szCs w:val="28"/>
-          <w:lang w:val="en-US"/>
-        </w:rPr>
-        <w:t>Model.php</w:t>
-      </w:r>
-      <w:proofErr w:type="spellEnd"/>
-      <w:r>
-        <w:rPr>
-          <w:sz w:val="28"/>
-          <w:szCs w:val="28"/>
-          <w:lang w:val="en-US"/>
-        </w:rPr>
-        <w:t>");</w:t>
+        <w:t>&lt;?php</w:t>
+      </w:r>
+      <w:r>
+        <w:rPr>
+          <w:sz w:val="28"/>
+          <w:szCs w:val="28"/>
+          <w:lang w:val="en-US"/>
+        </w:rPr>
+        <w:br/>
+        <w:t>include_once("model/Model.php");</w:t>
       </w:r>
       <w:r>
         <w:rPr>
@@ -1509,25 +1249,7 @@
           <w:lang w:val="en-US"/>
         </w:rPr>
         <w:br/>
-        <w:t xml:space="preserve">        if (!</w:t>
-      </w:r>
-      <w:proofErr w:type="spellStart"/>
-      <w:r>
-        <w:rPr>
-          <w:sz w:val="28"/>
-          <w:szCs w:val="28"/>
-          <w:lang w:val="en-US"/>
-        </w:rPr>
-        <w:t>isset</w:t>
-      </w:r>
-      <w:proofErr w:type="spellEnd"/>
-      <w:r>
-        <w:rPr>
-          <w:sz w:val="28"/>
-          <w:szCs w:val="28"/>
-          <w:lang w:val="en-US"/>
-        </w:rPr>
-        <w:t>($_GET['book']))</w:t>
+        <w:t xml:space="preserve">        if (!isset($_GET['book']))</w:t>
       </w:r>
       <w:r>
         <w:rPr>
@@ -1554,52 +1276,16 @@
           <w:lang w:val="en-US"/>
         </w:rPr>
         <w:br/>
-        <w:t xml:space="preserve">            $books = $this-&gt;model-&gt;</w:t>
-      </w:r>
-      <w:proofErr w:type="spellStart"/>
-      <w:r>
-        <w:rPr>
-          <w:sz w:val="28"/>
-          <w:szCs w:val="28"/>
-          <w:lang w:val="en-US"/>
-        </w:rPr>
-        <w:t>getBookList</w:t>
-      </w:r>
-      <w:proofErr w:type="spellEnd"/>
-      <w:r>
-        <w:rPr>
-          <w:sz w:val="28"/>
-          <w:szCs w:val="28"/>
-          <w:lang w:val="en-US"/>
-        </w:rPr>
-        <w:t>();</w:t>
-      </w:r>
-      <w:r>
-        <w:rPr>
-          <w:sz w:val="28"/>
-          <w:szCs w:val="28"/>
-          <w:lang w:val="en-US"/>
-        </w:rPr>
-        <w:br/>
-        <w:t xml:space="preserve">            include 'view/</w:t>
-      </w:r>
-      <w:proofErr w:type="spellStart"/>
-      <w:r>
-        <w:rPr>
-          <w:sz w:val="28"/>
-          <w:szCs w:val="28"/>
-          <w:lang w:val="en-US"/>
-        </w:rPr>
-        <w:t>booklist.php</w:t>
-      </w:r>
-      <w:proofErr w:type="spellEnd"/>
-      <w:r>
-        <w:rPr>
-          <w:sz w:val="28"/>
-          <w:szCs w:val="28"/>
-          <w:lang w:val="en-US"/>
-        </w:rPr>
-        <w:t>';</w:t>
+        <w:t xml:space="preserve">            $books = $this-&gt;model-&gt;getBookList();</w:t>
+      </w:r>
+      <w:r>
+        <w:rPr>
+          <w:sz w:val="28"/>
+          <w:szCs w:val="28"/>
+          <w:lang w:val="en-US"/>
+        </w:rPr>
+        <w:br/>
+        <w:t xml:space="preserve">            include 'view/booklist.php';</w:t>
       </w:r>
       <w:r>
         <w:rPr>
@@ -1652,52 +1338,16 @@
           <w:lang w:val="en-US"/>
         </w:rPr>
         <w:lastRenderedPageBreak/>
-        <w:t xml:space="preserve">            $book = $this-&gt;model-&gt;</w:t>
-      </w:r>
-      <w:proofErr w:type="spellStart"/>
-      <w:r>
-        <w:rPr>
-          <w:sz w:val="28"/>
-          <w:szCs w:val="28"/>
-          <w:lang w:val="en-US"/>
-        </w:rPr>
-        <w:t>getBook</w:t>
-      </w:r>
-      <w:proofErr w:type="spellEnd"/>
-      <w:r>
-        <w:rPr>
-          <w:sz w:val="28"/>
-          <w:szCs w:val="28"/>
-          <w:lang w:val="en-US"/>
-        </w:rPr>
-        <w:t>($_GET['book']);</w:t>
-      </w:r>
-      <w:r>
-        <w:rPr>
-          <w:sz w:val="28"/>
-          <w:szCs w:val="28"/>
-          <w:lang w:val="en-US"/>
-        </w:rPr>
-        <w:br/>
-        <w:t xml:space="preserve">            include 'view/</w:t>
-      </w:r>
-      <w:proofErr w:type="spellStart"/>
-      <w:r>
-        <w:rPr>
-          <w:sz w:val="28"/>
-          <w:szCs w:val="28"/>
-          <w:lang w:val="en-US"/>
-        </w:rPr>
-        <w:t>viewbook.php</w:t>
-      </w:r>
-      <w:proofErr w:type="spellEnd"/>
-      <w:r>
-        <w:rPr>
-          <w:sz w:val="28"/>
-          <w:szCs w:val="28"/>
-          <w:lang w:val="en-US"/>
-        </w:rPr>
-        <w:t>';</w:t>
+        <w:t xml:space="preserve">            $book = $this-&gt;model-&gt;getBook($_GET['book']);</w:t>
+      </w:r>
+      <w:r>
+        <w:rPr>
+          <w:sz w:val="28"/>
+          <w:szCs w:val="28"/>
+          <w:lang w:val="en-US"/>
+        </w:rPr>
+        <w:br/>
+        <w:t xml:space="preserve">            include 'view/viewbook.php';</w:t>
       </w:r>
       <w:r>
         <w:rPr>
@@ -1759,7 +1409,6 @@
         </w:rPr>
         <w:t xml:space="preserve">Програмний код ФАЙЛ </w:t>
       </w:r>
-      <w:proofErr w:type="spellStart"/>
       <w:r>
         <w:rPr>
           <w:b/>
@@ -1770,7 +1419,6 @@
         </w:rPr>
         <w:t>Book.php</w:t>
       </w:r>
-      <w:proofErr w:type="spellEnd"/>
     </w:p>
     <w:p>
       <w:pPr>
@@ -1788,18 +1436,8 @@
           <w:szCs w:val="28"/>
           <w:lang w:val="en-US"/>
         </w:rPr>
-        <w:t>&lt;?</w:t>
-      </w:r>
-      <w:proofErr w:type="spellStart"/>
-      <w:r>
-        <w:rPr>
-          <w:sz w:val="28"/>
-          <w:szCs w:val="28"/>
-          <w:lang w:val="en-US"/>
-        </w:rPr>
-        <w:t>php</w:t>
-      </w:r>
-      <w:proofErr w:type="spellEnd"/>
+        <w:t>&lt;?php</w:t>
+      </w:r>
       <w:r>
         <w:rPr>
           <w:sz w:val="28"/>
@@ -1851,45 +1489,17 @@
           <w:lang w:val="en-US"/>
         </w:rPr>
         <w:br/>
-        <w:t xml:space="preserve">    public function __</w:t>
-      </w:r>
-      <w:proofErr w:type="gramStart"/>
-      <w:r>
-        <w:rPr>
-          <w:sz w:val="28"/>
-          <w:szCs w:val="28"/>
-          <w:lang w:val="en-US"/>
-        </w:rPr>
-        <w:t>construct(</w:t>
-      </w:r>
-      <w:proofErr w:type="gramEnd"/>
-      <w:r>
-        <w:rPr>
-          <w:sz w:val="28"/>
-          <w:szCs w:val="28"/>
-          <w:lang w:val="en-US"/>
-        </w:rPr>
-        <w:t>$title, $author, $description)</w:t>
-      </w:r>
-      <w:r>
-        <w:rPr>
-          <w:sz w:val="28"/>
-          <w:szCs w:val="28"/>
-          <w:lang w:val="en-US"/>
-        </w:rPr>
-        <w:br/>
-        <w:t xml:space="preserve"> </w:t>
-      </w:r>
-      <w:proofErr w:type="gramStart"/>
-      <w:r>
-        <w:rPr>
-          <w:sz w:val="28"/>
-          <w:szCs w:val="28"/>
-          <w:lang w:val="en-US"/>
-        </w:rPr>
-        <w:t xml:space="preserve">   {</w:t>
-      </w:r>
-      <w:proofErr w:type="gramEnd"/>
+        <w:t xml:space="preserve">    public function __construct($title, $author, $description)</w:t>
+      </w:r>
+      <w:r>
+        <w:rPr>
+          <w:sz w:val="28"/>
+          <w:szCs w:val="28"/>
+          <w:lang w:val="en-US"/>
+        </w:rPr>
+        <w:br/>
+        <w:t xml:space="preserve">    {</w:t>
+      </w:r>
       <w:r>
         <w:rPr>
           <w:sz w:val="28"/>
@@ -1924,18 +1534,8 @@
           <w:lang w:val="en-US"/>
         </w:rPr>
         <w:br/>
-        <w:t xml:space="preserve">  </w:t>
-      </w:r>
-      <w:proofErr w:type="gramStart"/>
-      <w:r>
-        <w:rPr>
-          <w:sz w:val="28"/>
-          <w:szCs w:val="28"/>
-          <w:lang w:val="en-US"/>
-        </w:rPr>
-        <w:t xml:space="preserve">  }</w:t>
-      </w:r>
-      <w:proofErr w:type="gramEnd"/>
+        <w:t xml:space="preserve">    }</w:t>
+      </w:r>
       <w:r>
         <w:rPr>
           <w:sz w:val="28"/>
@@ -1978,7 +1578,6 @@
         </w:rPr>
         <w:t xml:space="preserve">Програмний код ФАЙЛ </w:t>
       </w:r>
-      <w:proofErr w:type="spellStart"/>
       <w:r>
         <w:rPr>
           <w:b/>
@@ -1989,7 +1588,6 @@
         </w:rPr>
         <w:t>Model.php</w:t>
       </w:r>
-      <w:proofErr w:type="spellEnd"/>
     </w:p>
     <w:p>
       <w:pPr>
@@ -2007,61 +1605,16 @@
           <w:szCs w:val="28"/>
           <w:lang w:val="en-US"/>
         </w:rPr>
-        <w:t>&lt;?</w:t>
-      </w:r>
-      <w:proofErr w:type="spellStart"/>
-      <w:r>
-        <w:rPr>
-          <w:sz w:val="28"/>
-          <w:szCs w:val="28"/>
-          <w:lang w:val="en-US"/>
-        </w:rPr>
-        <w:t>php</w:t>
-      </w:r>
-      <w:proofErr w:type="spellEnd"/>
-      <w:r>
-        <w:rPr>
-          <w:sz w:val="28"/>
-          <w:szCs w:val="28"/>
-          <w:lang w:val="en-US"/>
-        </w:rPr>
-        <w:br/>
-      </w:r>
-      <w:proofErr w:type="spellStart"/>
-      <w:r>
-        <w:rPr>
-          <w:sz w:val="28"/>
-          <w:szCs w:val="28"/>
-          <w:lang w:val="en-US"/>
-        </w:rPr>
-        <w:t>include_once</w:t>
-      </w:r>
-      <w:proofErr w:type="spellEnd"/>
-      <w:r>
-        <w:rPr>
-          <w:sz w:val="28"/>
-          <w:szCs w:val="28"/>
-          <w:lang w:val="en-US"/>
-        </w:rPr>
-        <w:t>("model/</w:t>
-      </w:r>
-      <w:proofErr w:type="spellStart"/>
-      <w:r>
-        <w:rPr>
-          <w:sz w:val="28"/>
-          <w:szCs w:val="28"/>
-          <w:lang w:val="en-US"/>
-        </w:rPr>
-        <w:t>Book.php</w:t>
-      </w:r>
-      <w:proofErr w:type="spellEnd"/>
-      <w:r>
-        <w:rPr>
-          <w:sz w:val="28"/>
-          <w:szCs w:val="28"/>
-          <w:lang w:val="en-US"/>
-        </w:rPr>
-        <w:t>");</w:t>
+        <w:t>&lt;?php</w:t>
+      </w:r>
+      <w:r>
+        <w:rPr>
+          <w:sz w:val="28"/>
+          <w:szCs w:val="28"/>
+          <w:lang w:val="en-US"/>
+        </w:rPr>
+        <w:br/>
+        <w:t>include_once("model/Book.php");</w:t>
       </w:r>
       <w:r>
         <w:rPr>
@@ -2087,25 +1640,7 @@
           <w:lang w:val="en-US"/>
         </w:rPr>
         <w:br/>
-        <w:t xml:space="preserve">    public function </w:t>
-      </w:r>
-      <w:proofErr w:type="spellStart"/>
-      <w:r>
-        <w:rPr>
-          <w:sz w:val="28"/>
-          <w:szCs w:val="28"/>
-          <w:lang w:val="en-US"/>
-        </w:rPr>
-        <w:t>getBookList</w:t>
-      </w:r>
-      <w:proofErr w:type="spellEnd"/>
-      <w:r>
-        <w:rPr>
-          <w:sz w:val="28"/>
-          <w:szCs w:val="28"/>
-          <w:lang w:val="en-US"/>
-        </w:rPr>
-        <w:t>()</w:t>
+        <w:t xml:space="preserve">    public function getBookList()</w:t>
       </w:r>
       <w:r>
         <w:rPr>
@@ -2186,25 +1721,7 @@
           <w:lang w:val="en-US"/>
         </w:rPr>
         <w:br/>
-        <w:t xml:space="preserve">    public function </w:t>
-      </w:r>
-      <w:proofErr w:type="spellStart"/>
-      <w:r>
-        <w:rPr>
-          <w:sz w:val="28"/>
-          <w:szCs w:val="28"/>
-          <w:lang w:val="en-US"/>
-        </w:rPr>
-        <w:t>getBook</w:t>
-      </w:r>
-      <w:proofErr w:type="spellEnd"/>
-      <w:r>
-        <w:rPr>
-          <w:sz w:val="28"/>
-          <w:szCs w:val="28"/>
-          <w:lang w:val="en-US"/>
-        </w:rPr>
-        <w:t>($title)</w:t>
+        <w:t xml:space="preserve">    public function getBook($title)</w:t>
       </w:r>
       <w:r>
         <w:rPr>
@@ -2231,97 +1748,25 @@
           <w:lang w:val="en-US"/>
         </w:rPr>
         <w:br/>
-        <w:t xml:space="preserve">        // in a real life scenario this will be done through a </w:t>
-      </w:r>
-      <w:proofErr w:type="spellStart"/>
-      <w:r>
-        <w:rPr>
-          <w:sz w:val="28"/>
-          <w:szCs w:val="28"/>
-          <w:lang w:val="en-US"/>
-        </w:rPr>
-        <w:t>db</w:t>
-      </w:r>
-      <w:proofErr w:type="spellEnd"/>
-      <w:r>
-        <w:rPr>
-          <w:sz w:val="28"/>
-          <w:szCs w:val="28"/>
-          <w:lang w:val="en-US"/>
-        </w:rPr>
-        <w:t xml:space="preserve"> select command</w:t>
-      </w:r>
-      <w:r>
-        <w:rPr>
-          <w:sz w:val="28"/>
-          <w:szCs w:val="28"/>
-          <w:lang w:val="en-US"/>
-        </w:rPr>
-        <w:br/>
-        <w:t xml:space="preserve">        $</w:t>
-      </w:r>
-      <w:proofErr w:type="spellStart"/>
-      <w:r>
-        <w:rPr>
-          <w:sz w:val="28"/>
-          <w:szCs w:val="28"/>
-          <w:lang w:val="en-US"/>
-        </w:rPr>
-        <w:t>allBooks</w:t>
-      </w:r>
-      <w:proofErr w:type="spellEnd"/>
-      <w:r>
-        <w:rPr>
-          <w:sz w:val="28"/>
-          <w:szCs w:val="28"/>
-          <w:lang w:val="en-US"/>
-        </w:rPr>
-        <w:t xml:space="preserve"> = $this-&gt;</w:t>
-      </w:r>
-      <w:proofErr w:type="spellStart"/>
-      <w:r>
-        <w:rPr>
-          <w:sz w:val="28"/>
-          <w:szCs w:val="28"/>
-          <w:lang w:val="en-US"/>
-        </w:rPr>
-        <w:t>getBookList</w:t>
-      </w:r>
-      <w:proofErr w:type="spellEnd"/>
-      <w:r>
-        <w:rPr>
-          <w:sz w:val="28"/>
-          <w:szCs w:val="28"/>
-          <w:lang w:val="en-US"/>
-        </w:rPr>
-        <w:t>();</w:t>
-      </w:r>
-      <w:r>
-        <w:rPr>
-          <w:sz w:val="28"/>
-          <w:szCs w:val="28"/>
-          <w:lang w:val="en-US"/>
-        </w:rPr>
-        <w:br/>
-        <w:t xml:space="preserve">        return $</w:t>
-      </w:r>
-      <w:proofErr w:type="spellStart"/>
-      <w:r>
-        <w:rPr>
-          <w:sz w:val="28"/>
-          <w:szCs w:val="28"/>
-          <w:lang w:val="en-US"/>
-        </w:rPr>
-        <w:t>allBooks</w:t>
-      </w:r>
-      <w:proofErr w:type="spellEnd"/>
-      <w:r>
-        <w:rPr>
-          <w:sz w:val="28"/>
-          <w:szCs w:val="28"/>
-          <w:lang w:val="en-US"/>
-        </w:rPr>
-        <w:t>[$title];</w:t>
+        <w:t xml:space="preserve">        // in a real life scenario this will be done through a db select command</w:t>
+      </w:r>
+      <w:r>
+        <w:rPr>
+          <w:sz w:val="28"/>
+          <w:szCs w:val="28"/>
+          <w:lang w:val="en-US"/>
+        </w:rPr>
+        <w:br/>
+        <w:t xml:space="preserve">        $allBooks = $this-&gt;getBookList();</w:t>
+      </w:r>
+      <w:r>
+        <w:rPr>
+          <w:sz w:val="28"/>
+          <w:szCs w:val="28"/>
+          <w:lang w:val="en-US"/>
+        </w:rPr>
+        <w:br/>
+        <w:t xml:space="preserve">        return $allBooks[$title];</w:t>
       </w:r>
       <w:r>
         <w:rPr>
@@ -2382,7 +1827,6 @@
         </w:rPr>
         <w:t xml:space="preserve">Програмний код ФАЙЛ </w:t>
       </w:r>
-      <w:proofErr w:type="spellStart"/>
       <w:r>
         <w:rPr>
           <w:b/>
@@ -2393,7 +1837,6 @@
         </w:rPr>
         <w:t>booklist.php</w:t>
       </w:r>
-      <w:proofErr w:type="spellEnd"/>
     </w:p>
     <w:p>
       <w:pPr>
@@ -2447,18 +1890,8 @@
           <w:lang w:val="en-US"/>
         </w:rPr>
         <w:br/>
-        <w:t xml:space="preserve">    &lt;?</w:t>
-      </w:r>
-      <w:proofErr w:type="spellStart"/>
-      <w:r>
-        <w:rPr>
-          <w:sz w:val="28"/>
-          <w:szCs w:val="28"/>
-          <w:lang w:val="en-US"/>
-        </w:rPr>
-        <w:t>php</w:t>
-      </w:r>
-      <w:proofErr w:type="spellEnd"/>
+        <w:t xml:space="preserve">    &lt;?php</w:t>
+      </w:r>
       <w:r>
         <w:rPr>
           <w:sz w:val="28"/>
@@ -2564,7 +1997,6 @@
         </w:rPr>
         <w:t xml:space="preserve">Програмний код ФАЙЛ </w:t>
       </w:r>
-      <w:proofErr w:type="spellStart"/>
       <w:r>
         <w:rPr>
           <w:b/>
@@ -2575,7 +2007,6 @@
         </w:rPr>
         <w:t>viewbook.php</w:t>
       </w:r>
-      <w:proofErr w:type="spellEnd"/>
     </w:p>
     <w:p>
       <w:pPr>
@@ -2620,206 +2051,34 @@
           <w:lang w:val="en-US"/>
         </w:rPr>
         <w:br/>
-        <w:t>&lt;?</w:t>
-      </w:r>
-      <w:proofErr w:type="spellStart"/>
-      <w:r>
-        <w:rPr>
-          <w:sz w:val="28"/>
-          <w:szCs w:val="28"/>
-          <w:lang w:val="en-US"/>
-        </w:rPr>
-        <w:t>php</w:t>
-      </w:r>
-      <w:proofErr w:type="spellEnd"/>
-      <w:r>
-        <w:rPr>
-          <w:sz w:val="28"/>
-          <w:szCs w:val="28"/>
-          <w:lang w:val="en-US"/>
-        </w:rPr>
-        <w:br/>
-        <w:t>echo 'Title:</w:t>
-      </w:r>
-      <w:proofErr w:type="gramStart"/>
-      <w:r>
-        <w:rPr>
-          <w:sz w:val="28"/>
-          <w:szCs w:val="28"/>
-          <w:lang w:val="en-US"/>
-        </w:rPr>
-        <w:t>' .</w:t>
-      </w:r>
-      <w:proofErr w:type="gramEnd"/>
-      <w:r>
-        <w:rPr>
-          <w:sz w:val="28"/>
-          <w:szCs w:val="28"/>
-          <w:lang w:val="en-US"/>
-        </w:rPr>
-        <w:t xml:space="preserve"> $book-&gt;</w:t>
-      </w:r>
-      <w:proofErr w:type="gramStart"/>
-      <w:r>
-        <w:rPr>
-          <w:sz w:val="28"/>
-          <w:szCs w:val="28"/>
-          <w:lang w:val="en-US"/>
-        </w:rPr>
-        <w:t>title .</w:t>
-      </w:r>
-      <w:proofErr w:type="gramEnd"/>
-      <w:r>
-        <w:rPr>
-          <w:sz w:val="28"/>
-          <w:szCs w:val="28"/>
-          <w:lang w:val="en-US"/>
-        </w:rPr>
-        <w:t xml:space="preserve"> '&lt;</w:t>
-      </w:r>
-      <w:proofErr w:type="spellStart"/>
-      <w:r>
-        <w:rPr>
-          <w:sz w:val="28"/>
-          <w:szCs w:val="28"/>
-          <w:lang w:val="en-US"/>
-        </w:rPr>
-        <w:t>br</w:t>
-      </w:r>
-      <w:proofErr w:type="spellEnd"/>
-      <w:r>
-        <w:rPr>
-          <w:sz w:val="28"/>
-          <w:szCs w:val="28"/>
-          <w:lang w:val="en-US"/>
-        </w:rPr>
-        <w:t>/&gt;';</w:t>
-      </w:r>
-      <w:r>
-        <w:rPr>
-          <w:sz w:val="28"/>
-          <w:szCs w:val="28"/>
-          <w:lang w:val="en-US"/>
-        </w:rPr>
-        <w:br/>
-        <w:t>echo 'Author:</w:t>
-      </w:r>
-      <w:proofErr w:type="gramStart"/>
-      <w:r>
-        <w:rPr>
-          <w:sz w:val="28"/>
-          <w:szCs w:val="28"/>
-          <w:lang w:val="en-US"/>
-        </w:rPr>
-        <w:t>' .</w:t>
-      </w:r>
-      <w:proofErr w:type="gramEnd"/>
-      <w:r>
-        <w:rPr>
-          <w:sz w:val="28"/>
-          <w:szCs w:val="28"/>
-          <w:lang w:val="en-US"/>
-        </w:rPr>
-        <w:t xml:space="preserve"> $book-&gt;</w:t>
-      </w:r>
-      <w:proofErr w:type="gramStart"/>
-      <w:r>
-        <w:rPr>
-          <w:sz w:val="28"/>
-          <w:szCs w:val="28"/>
-          <w:lang w:val="en-US"/>
-        </w:rPr>
-        <w:t>author .</w:t>
-      </w:r>
-      <w:proofErr w:type="gramEnd"/>
-      <w:r>
-        <w:rPr>
-          <w:sz w:val="28"/>
-          <w:szCs w:val="28"/>
-          <w:lang w:val="en-US"/>
-        </w:rPr>
-        <w:t xml:space="preserve"> '&lt;</w:t>
-      </w:r>
-      <w:proofErr w:type="spellStart"/>
-      <w:r>
-        <w:rPr>
-          <w:sz w:val="28"/>
-          <w:szCs w:val="28"/>
-          <w:lang w:val="en-US"/>
-        </w:rPr>
-        <w:t>br</w:t>
-      </w:r>
-      <w:proofErr w:type="spellEnd"/>
-      <w:r>
-        <w:rPr>
-          <w:sz w:val="28"/>
-          <w:szCs w:val="28"/>
-          <w:lang w:val="en-US"/>
-        </w:rPr>
-        <w:t>/&gt;';</w:t>
-      </w:r>
-      <w:r>
-        <w:rPr>
-          <w:sz w:val="28"/>
-          <w:szCs w:val="28"/>
-          <w:lang w:val="en-US"/>
-        </w:rPr>
-        <w:br/>
-        <w:t>echo 'Description:</w:t>
-      </w:r>
-      <w:proofErr w:type="gramStart"/>
-      <w:r>
-        <w:rPr>
-          <w:sz w:val="28"/>
-          <w:szCs w:val="28"/>
-          <w:lang w:val="en-US"/>
-        </w:rPr>
-        <w:t>' .</w:t>
-      </w:r>
-      <w:proofErr w:type="gramEnd"/>
-      <w:r>
-        <w:rPr>
-          <w:sz w:val="28"/>
-          <w:szCs w:val="28"/>
-          <w:lang w:val="en-US"/>
-        </w:rPr>
-        <w:t xml:space="preserve"> $book-&gt;</w:t>
-      </w:r>
-      <w:proofErr w:type="gramStart"/>
-      <w:r>
-        <w:rPr>
-          <w:sz w:val="28"/>
-          <w:szCs w:val="28"/>
-          <w:lang w:val="en-US"/>
-        </w:rPr>
-        <w:t>description .</w:t>
-      </w:r>
-      <w:proofErr w:type="gramEnd"/>
-      <w:r>
-        <w:rPr>
-          <w:sz w:val="28"/>
-          <w:szCs w:val="28"/>
-          <w:lang w:val="en-US"/>
-        </w:rPr>
-        <w:t xml:space="preserve"> '&lt;</w:t>
-      </w:r>
-      <w:proofErr w:type="spellStart"/>
-      <w:r>
-        <w:rPr>
-          <w:sz w:val="28"/>
-          <w:szCs w:val="28"/>
-          <w:lang w:val="en-US"/>
-        </w:rPr>
-        <w:t>br</w:t>
-      </w:r>
-      <w:proofErr w:type="spellEnd"/>
-      <w:r>
-        <w:rPr>
-          <w:sz w:val="28"/>
-          <w:szCs w:val="28"/>
-          <w:lang w:val="en-US"/>
-        </w:rPr>
-        <w:t>/&gt;';</w:t>
+        <w:t>&lt;?php</w:t>
+      </w:r>
+      <w:r>
+        <w:rPr>
+          <w:sz w:val="28"/>
+          <w:szCs w:val="28"/>
+          <w:lang w:val="en-US"/>
+        </w:rPr>
+        <w:br/>
+        <w:t>echo 'Title:' . $book-&gt;title . '&lt;br/&gt;';</w:t>
+      </w:r>
+      <w:r>
+        <w:rPr>
+          <w:sz w:val="28"/>
+          <w:szCs w:val="28"/>
+          <w:lang w:val="en-US"/>
+        </w:rPr>
+        <w:br/>
+        <w:t>echo 'Author:' . $book-&gt;author . '&lt;br/&gt;';</w:t>
+      </w:r>
+      <w:r>
+        <w:rPr>
+          <w:sz w:val="28"/>
+          <w:szCs w:val="28"/>
+          <w:lang w:val="en-US"/>
+        </w:rPr>
+        <w:br/>
+        <w:t>echo 'Description:' . $book-&gt;description . '&lt;br/&gt;';</w:t>
       </w:r>
       <w:r>
         <w:rPr>
@@ -2881,7 +2140,6 @@
         </w:rPr>
         <w:t xml:space="preserve">Програмний код ФАЙЛ </w:t>
       </w:r>
-      <w:proofErr w:type="spellStart"/>
       <w:r>
         <w:rPr>
           <w:b/>
@@ -2892,7 +2150,6 @@
         </w:rPr>
         <w:t>index.php</w:t>
       </w:r>
-      <w:proofErr w:type="spellEnd"/>
     </w:p>
     <w:p>
       <w:pPr>
@@ -2910,61 +2167,16 @@
           <w:szCs w:val="28"/>
           <w:lang w:val="en-US"/>
         </w:rPr>
-        <w:t>&lt;?</w:t>
-      </w:r>
-      <w:proofErr w:type="spellStart"/>
-      <w:r>
-        <w:rPr>
-          <w:sz w:val="28"/>
-          <w:szCs w:val="28"/>
-          <w:lang w:val="en-US"/>
-        </w:rPr>
-        <w:t>php</w:t>
-      </w:r>
-      <w:proofErr w:type="spellEnd"/>
-      <w:r>
-        <w:rPr>
-          <w:sz w:val="28"/>
-          <w:szCs w:val="28"/>
-          <w:lang w:val="en-US"/>
-        </w:rPr>
-        <w:br/>
-      </w:r>
-      <w:proofErr w:type="spellStart"/>
-      <w:r>
-        <w:rPr>
-          <w:sz w:val="28"/>
-          <w:szCs w:val="28"/>
-          <w:lang w:val="en-US"/>
-        </w:rPr>
-        <w:t>include_once</w:t>
-      </w:r>
-      <w:proofErr w:type="spellEnd"/>
-      <w:r>
-        <w:rPr>
-          <w:sz w:val="28"/>
-          <w:szCs w:val="28"/>
-          <w:lang w:val="en-US"/>
-        </w:rPr>
-        <w:t>("controller/</w:t>
-      </w:r>
-      <w:proofErr w:type="spellStart"/>
-      <w:r>
-        <w:rPr>
-          <w:sz w:val="28"/>
-          <w:szCs w:val="28"/>
-          <w:lang w:val="en-US"/>
-        </w:rPr>
-        <w:t>Controller.php</w:t>
-      </w:r>
-      <w:proofErr w:type="spellEnd"/>
-      <w:r>
-        <w:rPr>
-          <w:sz w:val="28"/>
-          <w:szCs w:val="28"/>
-          <w:lang w:val="en-US"/>
-        </w:rPr>
-        <w:t>");</w:t>
+        <w:t>&lt;?php</w:t>
+      </w:r>
+      <w:r>
+        <w:rPr>
+          <w:sz w:val="28"/>
+          <w:szCs w:val="28"/>
+          <w:lang w:val="en-US"/>
+        </w:rPr>
+        <w:br/>
+        <w:t>include_once("controller/Controller.php");</w:t>
       </w:r>
       <w:r>
         <w:rPr>
@@ -2982,18 +2194,8 @@
           <w:lang w:val="en-US"/>
         </w:rPr>
         <w:br/>
-        <w:t>$controller-&gt;</w:t>
-      </w:r>
-      <w:proofErr w:type="gramStart"/>
-      <w:r>
-        <w:rPr>
-          <w:sz w:val="28"/>
-          <w:szCs w:val="28"/>
-          <w:lang w:val="en-US"/>
-        </w:rPr>
-        <w:t>invoke();</w:t>
-      </w:r>
-      <w:proofErr w:type="gramEnd"/>
+        <w:t>$controller-&gt;invoke();</w:t>
+      </w:r>
     </w:p>
     <w:p>
       <w:pPr>
@@ -3053,421 +2255,12 @@
         </w:rPr>
         <w:t xml:space="preserve"> </w:t>
       </w:r>
-      <w:proofErr w:type="spellStart"/>
-      <w:r>
-        <w:rPr>
-          <w:sz w:val="28"/>
-          <w:szCs w:val="28"/>
-        </w:rPr>
-        <w:t>Створіть</w:t>
-      </w:r>
-      <w:proofErr w:type="spellEnd"/>
-      <w:r>
-        <w:rPr>
-          <w:sz w:val="28"/>
-          <w:szCs w:val="28"/>
-        </w:rPr>
-        <w:t xml:space="preserve"> базу </w:t>
-      </w:r>
-      <w:proofErr w:type="spellStart"/>
-      <w:r>
-        <w:rPr>
-          <w:sz w:val="28"/>
-          <w:szCs w:val="28"/>
-        </w:rPr>
-        <w:t>даних</w:t>
-      </w:r>
-      <w:proofErr w:type="spellEnd"/>
-      <w:r>
-        <w:rPr>
-          <w:sz w:val="28"/>
-          <w:szCs w:val="28"/>
-        </w:rPr>
-        <w:t xml:space="preserve"> з </w:t>
-      </w:r>
-      <w:proofErr w:type="spellStart"/>
-      <w:r>
-        <w:rPr>
-          <w:sz w:val="28"/>
-          <w:szCs w:val="28"/>
-        </w:rPr>
-        <w:t>двома</w:t>
-      </w:r>
-      <w:proofErr w:type="spellEnd"/>
-      <w:r>
-        <w:rPr>
-          <w:sz w:val="28"/>
-          <w:szCs w:val="28"/>
-        </w:rPr>
-        <w:t xml:space="preserve"> </w:t>
-      </w:r>
-      <w:proofErr w:type="spellStart"/>
-      <w:r>
-        <w:rPr>
-          <w:sz w:val="28"/>
-          <w:szCs w:val="28"/>
-        </w:rPr>
-        <w:t>таблицями</w:t>
-      </w:r>
-      <w:proofErr w:type="spellEnd"/>
-      <w:r>
-        <w:rPr>
-          <w:sz w:val="28"/>
-          <w:szCs w:val="28"/>
-        </w:rPr>
-        <w:t xml:space="preserve"> – книги (</w:t>
-      </w:r>
-      <w:proofErr w:type="spellStart"/>
-      <w:r>
-        <w:rPr>
-          <w:sz w:val="28"/>
-          <w:szCs w:val="28"/>
-        </w:rPr>
-        <w:t>назва</w:t>
-      </w:r>
-      <w:proofErr w:type="spellEnd"/>
-      <w:r>
-        <w:rPr>
-          <w:sz w:val="28"/>
-          <w:szCs w:val="28"/>
-        </w:rPr>
-        <w:t xml:space="preserve">, </w:t>
-      </w:r>
-      <w:proofErr w:type="spellStart"/>
-      <w:r>
-        <w:rPr>
-          <w:sz w:val="28"/>
-          <w:szCs w:val="28"/>
-        </w:rPr>
-        <w:t>опис</w:t>
-      </w:r>
-      <w:proofErr w:type="spellEnd"/>
-      <w:r>
-        <w:rPr>
-          <w:sz w:val="28"/>
-          <w:szCs w:val="28"/>
-        </w:rPr>
-        <w:t xml:space="preserve">, </w:t>
-      </w:r>
-      <w:proofErr w:type="spellStart"/>
-      <w:r>
-        <w:rPr>
-          <w:sz w:val="28"/>
-          <w:szCs w:val="28"/>
-        </w:rPr>
-        <w:t>рік</w:t>
-      </w:r>
-      <w:proofErr w:type="spellEnd"/>
-      <w:r>
-        <w:rPr>
-          <w:sz w:val="28"/>
-          <w:szCs w:val="28"/>
-        </w:rPr>
-        <w:t xml:space="preserve"> </w:t>
-      </w:r>
-      <w:proofErr w:type="spellStart"/>
-      <w:r>
-        <w:rPr>
-          <w:sz w:val="28"/>
-          <w:szCs w:val="28"/>
-        </w:rPr>
-        <w:t>видання</w:t>
-      </w:r>
-      <w:proofErr w:type="spellEnd"/>
-      <w:r>
-        <w:rPr>
-          <w:sz w:val="28"/>
-          <w:szCs w:val="28"/>
-        </w:rPr>
-        <w:t xml:space="preserve">, </w:t>
-      </w:r>
-      <w:proofErr w:type="spellStart"/>
-      <w:r>
-        <w:rPr>
-          <w:sz w:val="28"/>
-          <w:szCs w:val="28"/>
-        </w:rPr>
-        <w:t>кількість</w:t>
-      </w:r>
-      <w:proofErr w:type="spellEnd"/>
-      <w:r>
-        <w:rPr>
-          <w:sz w:val="28"/>
-          <w:szCs w:val="28"/>
-        </w:rPr>
-        <w:t xml:space="preserve"> </w:t>
-      </w:r>
-      <w:proofErr w:type="spellStart"/>
-      <w:r>
-        <w:rPr>
-          <w:sz w:val="28"/>
-          <w:szCs w:val="28"/>
-        </w:rPr>
-        <w:t>сторінок</w:t>
-      </w:r>
-      <w:proofErr w:type="spellEnd"/>
-      <w:r>
-        <w:rPr>
-          <w:sz w:val="28"/>
-          <w:szCs w:val="28"/>
-        </w:rPr>
-        <w:t xml:space="preserve">, фото </w:t>
-      </w:r>
-      <w:proofErr w:type="spellStart"/>
-      <w:r>
-        <w:rPr>
-          <w:sz w:val="28"/>
-          <w:szCs w:val="28"/>
-        </w:rPr>
-        <w:t>обкладинки</w:t>
-      </w:r>
-      <w:proofErr w:type="spellEnd"/>
-      <w:r>
-        <w:rPr>
-          <w:sz w:val="28"/>
-          <w:szCs w:val="28"/>
-        </w:rPr>
-        <w:t>) та автор (</w:t>
-      </w:r>
-      <w:proofErr w:type="spellStart"/>
-      <w:r>
-        <w:rPr>
-          <w:sz w:val="28"/>
-          <w:szCs w:val="28"/>
-        </w:rPr>
-        <w:t>прізвище</w:t>
-      </w:r>
-      <w:proofErr w:type="spellEnd"/>
-      <w:r>
-        <w:rPr>
-          <w:sz w:val="28"/>
-          <w:szCs w:val="28"/>
-        </w:rPr>
-        <w:t xml:space="preserve">, </w:t>
-      </w:r>
-      <w:proofErr w:type="spellStart"/>
-      <w:r>
-        <w:rPr>
-          <w:sz w:val="28"/>
-          <w:szCs w:val="28"/>
-        </w:rPr>
-        <w:t>ім’я</w:t>
-      </w:r>
-      <w:proofErr w:type="spellEnd"/>
-      <w:r>
-        <w:rPr>
-          <w:sz w:val="28"/>
-          <w:szCs w:val="28"/>
-        </w:rPr>
-        <w:t xml:space="preserve">, </w:t>
-      </w:r>
-      <w:proofErr w:type="spellStart"/>
-      <w:r>
-        <w:rPr>
-          <w:sz w:val="28"/>
-          <w:szCs w:val="28"/>
-        </w:rPr>
-        <w:t>країна</w:t>
-      </w:r>
-      <w:proofErr w:type="spellEnd"/>
-      <w:r>
-        <w:rPr>
-          <w:sz w:val="28"/>
-          <w:szCs w:val="28"/>
-        </w:rPr>
-        <w:t xml:space="preserve">). </w:t>
-      </w:r>
-      <w:proofErr w:type="spellStart"/>
-      <w:r>
-        <w:rPr>
-          <w:sz w:val="28"/>
-          <w:szCs w:val="28"/>
-        </w:rPr>
-        <w:t>Реалізуйте</w:t>
-      </w:r>
-      <w:proofErr w:type="spellEnd"/>
-      <w:r>
-        <w:rPr>
-          <w:sz w:val="28"/>
-          <w:szCs w:val="28"/>
-        </w:rPr>
-        <w:t xml:space="preserve"> за </w:t>
-      </w:r>
-      <w:proofErr w:type="spellStart"/>
-      <w:r>
-        <w:rPr>
-          <w:sz w:val="28"/>
-          <w:szCs w:val="28"/>
-        </w:rPr>
-        <w:t>допомогою</w:t>
-      </w:r>
-      <w:proofErr w:type="spellEnd"/>
-      <w:r>
-        <w:rPr>
-          <w:sz w:val="28"/>
-          <w:szCs w:val="28"/>
-        </w:rPr>
-        <w:t xml:space="preserve"> </w:t>
-      </w:r>
-      <w:proofErr w:type="spellStart"/>
-      <w:r>
-        <w:rPr>
-          <w:sz w:val="28"/>
-          <w:szCs w:val="28"/>
-        </w:rPr>
-        <w:t>патерну</w:t>
-      </w:r>
-      <w:proofErr w:type="spellEnd"/>
-      <w:r>
-        <w:rPr>
-          <w:sz w:val="28"/>
-          <w:szCs w:val="28"/>
-        </w:rPr>
-        <w:t xml:space="preserve"> MVC </w:t>
-      </w:r>
-      <w:proofErr w:type="spellStart"/>
-      <w:r>
-        <w:rPr>
-          <w:sz w:val="28"/>
-          <w:szCs w:val="28"/>
-        </w:rPr>
-        <w:t>виведення</w:t>
-      </w:r>
-      <w:proofErr w:type="spellEnd"/>
-      <w:r>
-        <w:rPr>
-          <w:sz w:val="28"/>
-          <w:szCs w:val="28"/>
-        </w:rPr>
-        <w:t xml:space="preserve"> </w:t>
-      </w:r>
-      <w:proofErr w:type="spellStart"/>
-      <w:r>
-        <w:rPr>
-          <w:sz w:val="28"/>
-          <w:szCs w:val="28"/>
-        </w:rPr>
-        <w:t>даних</w:t>
-      </w:r>
-      <w:proofErr w:type="spellEnd"/>
-      <w:r>
-        <w:rPr>
-          <w:sz w:val="28"/>
-          <w:szCs w:val="28"/>
-        </w:rPr>
-        <w:t xml:space="preserve"> з </w:t>
-      </w:r>
-      <w:proofErr w:type="spellStart"/>
-      <w:r>
-        <w:rPr>
-          <w:sz w:val="28"/>
-          <w:szCs w:val="28"/>
-        </w:rPr>
-        <w:t>таблиць</w:t>
-      </w:r>
-      <w:proofErr w:type="spellEnd"/>
-      <w:r>
-        <w:rPr>
-          <w:sz w:val="28"/>
-          <w:szCs w:val="28"/>
-        </w:rPr>
-        <w:t xml:space="preserve"> на </w:t>
-      </w:r>
-      <w:proofErr w:type="spellStart"/>
-      <w:r>
-        <w:rPr>
-          <w:sz w:val="28"/>
-          <w:szCs w:val="28"/>
-        </w:rPr>
-        <w:t>web-сторінку</w:t>
-      </w:r>
-      <w:proofErr w:type="spellEnd"/>
-      <w:r>
-        <w:rPr>
-          <w:sz w:val="28"/>
-          <w:szCs w:val="28"/>
-        </w:rPr>
-        <w:t xml:space="preserve">. </w:t>
-      </w:r>
-      <w:proofErr w:type="spellStart"/>
-      <w:r>
-        <w:rPr>
-          <w:sz w:val="28"/>
-          <w:szCs w:val="28"/>
-        </w:rPr>
-        <w:t>Організуйте</w:t>
-      </w:r>
-      <w:proofErr w:type="spellEnd"/>
-      <w:r>
-        <w:rPr>
-          <w:sz w:val="28"/>
-          <w:szCs w:val="28"/>
-        </w:rPr>
-        <w:t xml:space="preserve"> </w:t>
-      </w:r>
-      <w:proofErr w:type="spellStart"/>
-      <w:r>
-        <w:rPr>
-          <w:sz w:val="28"/>
-          <w:szCs w:val="28"/>
-        </w:rPr>
-        <w:t>можливість</w:t>
-      </w:r>
-      <w:proofErr w:type="spellEnd"/>
-      <w:r>
-        <w:rPr>
-          <w:sz w:val="28"/>
-          <w:szCs w:val="28"/>
-        </w:rPr>
-        <w:t xml:space="preserve"> </w:t>
-      </w:r>
-      <w:proofErr w:type="spellStart"/>
-      <w:r>
-        <w:rPr>
-          <w:sz w:val="28"/>
-          <w:szCs w:val="28"/>
-        </w:rPr>
-        <w:t>пошуку</w:t>
-      </w:r>
-      <w:proofErr w:type="spellEnd"/>
-      <w:r>
-        <w:rPr>
-          <w:sz w:val="28"/>
-          <w:szCs w:val="28"/>
-        </w:rPr>
-        <w:t xml:space="preserve"> на веб-</w:t>
-      </w:r>
-      <w:proofErr w:type="spellStart"/>
-      <w:r>
-        <w:rPr>
-          <w:sz w:val="28"/>
-          <w:szCs w:val="28"/>
-        </w:rPr>
-        <w:t>сторінці</w:t>
-      </w:r>
-      <w:proofErr w:type="spellEnd"/>
-      <w:r>
-        <w:rPr>
-          <w:sz w:val="28"/>
-          <w:szCs w:val="28"/>
-        </w:rPr>
-        <w:t xml:space="preserve"> за автором та </w:t>
-      </w:r>
-      <w:proofErr w:type="spellStart"/>
-      <w:r>
-        <w:rPr>
-          <w:sz w:val="28"/>
-          <w:szCs w:val="28"/>
-        </w:rPr>
-        <w:t>назвою</w:t>
-      </w:r>
-      <w:proofErr w:type="spellEnd"/>
-      <w:r>
-        <w:rPr>
-          <w:sz w:val="28"/>
-          <w:szCs w:val="28"/>
-        </w:rPr>
-        <w:t xml:space="preserve"> книги.</w:t>
+      <w:r>
+        <w:rPr>
+          <w:sz w:val="28"/>
+          <w:szCs w:val="28"/>
+        </w:rPr>
+        <w:t>Створіть базу даних з двома таблицями – книги (назва, опис, рік видання, кількість сторінок, фото обкладинки) та автор (прізвище, ім’я, країна). Реалізуйте за допомогою патерну MVC виведення даних з таблиць на web-сторінку. Організуйте можливість пошуку на веб-сторінці за автором та назвою книги.</w:t>
       </w:r>
     </w:p>
     <w:p>
@@ -3851,7 +2644,6 @@
         </w:rPr>
         <w:t xml:space="preserve"> ФАЙЛ </w:t>
       </w:r>
-      <w:proofErr w:type="spellStart"/>
       <w:r>
         <w:rPr>
           <w:b/>
@@ -3862,7 +2654,6 @@
         </w:rPr>
         <w:t>Controller.php</w:t>
       </w:r>
-      <w:proofErr w:type="spellEnd"/>
     </w:p>
     <w:p>
       <w:pPr>
@@ -3880,61 +2671,16 @@
           <w:szCs w:val="28"/>
           <w:lang w:val="en-US"/>
         </w:rPr>
-        <w:t>&lt;?</w:t>
-      </w:r>
-      <w:proofErr w:type="spellStart"/>
-      <w:r>
-        <w:rPr>
-          <w:sz w:val="28"/>
-          <w:szCs w:val="28"/>
-          <w:lang w:val="en-US"/>
-        </w:rPr>
-        <w:t>php</w:t>
-      </w:r>
-      <w:proofErr w:type="spellEnd"/>
-      <w:r>
-        <w:rPr>
-          <w:sz w:val="28"/>
-          <w:szCs w:val="28"/>
-          <w:lang w:val="en-US"/>
-        </w:rPr>
-        <w:br/>
-      </w:r>
-      <w:proofErr w:type="spellStart"/>
-      <w:r>
-        <w:rPr>
-          <w:sz w:val="28"/>
-          <w:szCs w:val="28"/>
-          <w:lang w:val="en-US"/>
-        </w:rPr>
-        <w:t>include_once</w:t>
-      </w:r>
-      <w:proofErr w:type="spellEnd"/>
-      <w:r>
-        <w:rPr>
-          <w:sz w:val="28"/>
-          <w:szCs w:val="28"/>
-          <w:lang w:val="en-US"/>
-        </w:rPr>
-        <w:t>("model/</w:t>
-      </w:r>
-      <w:proofErr w:type="spellStart"/>
-      <w:r>
-        <w:rPr>
-          <w:sz w:val="28"/>
-          <w:szCs w:val="28"/>
-          <w:lang w:val="en-US"/>
-        </w:rPr>
-        <w:t>Model.php</w:t>
-      </w:r>
-      <w:proofErr w:type="spellEnd"/>
-      <w:r>
-        <w:rPr>
-          <w:sz w:val="28"/>
-          <w:szCs w:val="28"/>
-          <w:lang w:val="en-US"/>
-        </w:rPr>
-        <w:t>");</w:t>
+        <w:t>&lt;?php</w:t>
+      </w:r>
+      <w:r>
+        <w:rPr>
+          <w:sz w:val="28"/>
+          <w:szCs w:val="28"/>
+          <w:lang w:val="en-US"/>
+        </w:rPr>
+        <w:br/>
+        <w:t>include_once("model/Model.php");</w:t>
       </w:r>
       <w:r>
         <w:rPr>
@@ -4021,25 +2767,7 @@
           <w:lang w:val="en-US"/>
         </w:rPr>
         <w:br/>
-        <w:t xml:space="preserve">        $</w:t>
-      </w:r>
-      <w:proofErr w:type="spellStart"/>
-      <w:r>
-        <w:rPr>
-          <w:sz w:val="28"/>
-          <w:szCs w:val="28"/>
-          <w:lang w:val="en-US"/>
-        </w:rPr>
-        <w:t>searchQuery</w:t>
-      </w:r>
-      <w:proofErr w:type="spellEnd"/>
-      <w:r>
-        <w:rPr>
-          <w:sz w:val="28"/>
-          <w:szCs w:val="28"/>
-          <w:lang w:val="en-US"/>
-        </w:rPr>
-        <w:t xml:space="preserve"> = "";</w:t>
+        <w:t xml:space="preserve">        $searchQuery = "";</w:t>
       </w:r>
       <w:r>
         <w:rPr>
@@ -4065,52 +2793,16 @@
           <w:lang w:val="en-US"/>
         </w:rPr>
         <w:br/>
-        <w:t xml:space="preserve">        if (</w:t>
-      </w:r>
-      <w:proofErr w:type="spellStart"/>
-      <w:r>
-        <w:rPr>
-          <w:sz w:val="28"/>
-          <w:szCs w:val="28"/>
-          <w:lang w:val="en-US"/>
-        </w:rPr>
-        <w:t>isset</w:t>
-      </w:r>
-      <w:proofErr w:type="spellEnd"/>
-      <w:r>
-        <w:rPr>
-          <w:sz w:val="28"/>
-          <w:szCs w:val="28"/>
-          <w:lang w:val="en-US"/>
-        </w:rPr>
-        <w:t>($_GET['search'])) {</w:t>
-      </w:r>
-      <w:r>
-        <w:rPr>
-          <w:sz w:val="28"/>
-          <w:szCs w:val="28"/>
-          <w:lang w:val="en-US"/>
-        </w:rPr>
-        <w:br/>
-        <w:t xml:space="preserve">            $</w:t>
-      </w:r>
-      <w:proofErr w:type="spellStart"/>
-      <w:r>
-        <w:rPr>
-          <w:sz w:val="28"/>
-          <w:szCs w:val="28"/>
-          <w:lang w:val="en-US"/>
-        </w:rPr>
-        <w:t>searchQuery</w:t>
-      </w:r>
-      <w:proofErr w:type="spellEnd"/>
-      <w:r>
-        <w:rPr>
-          <w:sz w:val="28"/>
-          <w:szCs w:val="28"/>
-          <w:lang w:val="en-US"/>
-        </w:rPr>
-        <w:t xml:space="preserve"> = $_GET['search'];</w:t>
+        <w:t xml:space="preserve">        if (isset($_GET['search'])) {</w:t>
+      </w:r>
+      <w:r>
+        <w:rPr>
+          <w:sz w:val="28"/>
+          <w:szCs w:val="28"/>
+          <w:lang w:val="en-US"/>
+        </w:rPr>
+        <w:br/>
+        <w:t xml:space="preserve">            $searchQuery = $_GET['search'];</w:t>
       </w:r>
       <w:r>
         <w:rPr>
@@ -4145,43 +2837,7 @@
           <w:lang w:val="en-US"/>
         </w:rPr>
         <w:br/>
-        <w:t xml:space="preserve">        $books = $this-&gt;model-&gt;</w:t>
-      </w:r>
-      <w:proofErr w:type="spellStart"/>
-      <w:r>
-        <w:rPr>
-          <w:sz w:val="28"/>
-          <w:szCs w:val="28"/>
-          <w:lang w:val="en-US"/>
-        </w:rPr>
-        <w:t>findBooks</w:t>
-      </w:r>
-      <w:proofErr w:type="spellEnd"/>
-      <w:r>
-        <w:rPr>
-          <w:sz w:val="28"/>
-          <w:szCs w:val="28"/>
-          <w:lang w:val="en-US"/>
-        </w:rPr>
-        <w:t>($</w:t>
-      </w:r>
-      <w:proofErr w:type="spellStart"/>
-      <w:r>
-        <w:rPr>
-          <w:sz w:val="28"/>
-          <w:szCs w:val="28"/>
-          <w:lang w:val="en-US"/>
-        </w:rPr>
-        <w:t>searchQuery</w:t>
-      </w:r>
-      <w:proofErr w:type="spellEnd"/>
-      <w:r>
-        <w:rPr>
-          <w:sz w:val="28"/>
-          <w:szCs w:val="28"/>
-          <w:lang w:val="en-US"/>
-        </w:rPr>
-        <w:t>);</w:t>
+        <w:t xml:space="preserve">        $books = $this-&gt;model-&gt;findBooks($searchQuery);</w:t>
       </w:r>
       <w:r>
         <w:rPr>
@@ -4207,25 +2863,7 @@
           <w:lang w:val="en-US"/>
         </w:rPr>
         <w:br/>
-        <w:t xml:space="preserve">        include 'view/</w:t>
-      </w:r>
-      <w:proofErr w:type="spellStart"/>
-      <w:r>
-        <w:rPr>
-          <w:sz w:val="28"/>
-          <w:szCs w:val="28"/>
-          <w:lang w:val="en-US"/>
-        </w:rPr>
-        <w:t>list.php</w:t>
-      </w:r>
-      <w:proofErr w:type="spellEnd"/>
-      <w:r>
-        <w:rPr>
-          <w:sz w:val="28"/>
-          <w:szCs w:val="28"/>
-          <w:lang w:val="en-US"/>
-        </w:rPr>
-        <w:t>';</w:t>
+        <w:t xml:space="preserve">        include 'view/list.php';</w:t>
       </w:r>
       <w:r>
         <w:rPr>
@@ -4295,7 +2933,6 @@
         </w:rPr>
         <w:t xml:space="preserve">Програмний код ФАЙЛ </w:t>
       </w:r>
-      <w:proofErr w:type="spellStart"/>
       <w:r>
         <w:rPr>
           <w:b/>
@@ -4306,7 +2943,6 @@
         </w:rPr>
         <w:t>Model.php</w:t>
       </w:r>
-      <w:proofErr w:type="spellEnd"/>
     </w:p>
     <w:p>
       <w:pPr>
@@ -4324,18 +2960,8 @@
           <w:szCs w:val="28"/>
           <w:lang w:val="en-US"/>
         </w:rPr>
-        <w:t>&lt;?</w:t>
-      </w:r>
-      <w:proofErr w:type="spellStart"/>
-      <w:r>
-        <w:rPr>
-          <w:sz w:val="28"/>
-          <w:szCs w:val="28"/>
-          <w:lang w:val="en-US"/>
-        </w:rPr>
-        <w:t>php</w:t>
-      </w:r>
-      <w:proofErr w:type="spellEnd"/>
+        <w:t>&lt;?php</w:t>
+      </w:r>
       <w:r>
         <w:rPr>
           <w:sz w:val="28"/>
@@ -4360,25 +2986,7 @@
           <w:lang w:val="en-US"/>
         </w:rPr>
         <w:br/>
-        <w:t xml:space="preserve">    private $</w:t>
-      </w:r>
-      <w:proofErr w:type="spellStart"/>
-      <w:r>
-        <w:rPr>
-          <w:sz w:val="28"/>
-          <w:szCs w:val="28"/>
-          <w:lang w:val="en-US"/>
-        </w:rPr>
-        <w:t>pdo</w:t>
-      </w:r>
-      <w:proofErr w:type="spellEnd"/>
-      <w:r>
-        <w:rPr>
-          <w:sz w:val="28"/>
-          <w:szCs w:val="28"/>
-          <w:lang w:val="en-US"/>
-        </w:rPr>
-        <w:t>;</w:t>
+        <w:t xml:space="preserve">    private $pdo;</w:t>
       </w:r>
       <w:r>
         <w:rPr>
@@ -4413,79 +3021,7 @@
           <w:lang w:val="en-US"/>
         </w:rPr>
         <w:br/>
-        <w:t xml:space="preserve">        $this-&gt;</w:t>
-      </w:r>
-      <w:proofErr w:type="spellStart"/>
-      <w:r>
-        <w:rPr>
-          <w:sz w:val="28"/>
-          <w:szCs w:val="28"/>
-          <w:lang w:val="en-US"/>
-        </w:rPr>
-        <w:t>pdo</w:t>
-      </w:r>
-      <w:proofErr w:type="spellEnd"/>
-      <w:r>
-        <w:rPr>
-          <w:sz w:val="28"/>
-          <w:szCs w:val="28"/>
-          <w:lang w:val="en-US"/>
-        </w:rPr>
-        <w:t xml:space="preserve"> = new PDO("</w:t>
-      </w:r>
-      <w:proofErr w:type="spellStart"/>
-      <w:r>
-        <w:rPr>
-          <w:sz w:val="28"/>
-          <w:szCs w:val="28"/>
-          <w:lang w:val="en-US"/>
-        </w:rPr>
-        <w:t>mysql:host</w:t>
-      </w:r>
-      <w:proofErr w:type="spellEnd"/>
-      <w:r>
-        <w:rPr>
-          <w:sz w:val="28"/>
-          <w:szCs w:val="28"/>
-          <w:lang w:val="en-US"/>
-        </w:rPr>
-        <w:t>=</w:t>
-      </w:r>
-      <w:proofErr w:type="spellStart"/>
-      <w:r>
-        <w:rPr>
-          <w:sz w:val="28"/>
-          <w:szCs w:val="28"/>
-          <w:lang w:val="en-US"/>
-        </w:rPr>
-        <w:t>localhost;dbname</w:t>
-      </w:r>
-      <w:proofErr w:type="spellEnd"/>
-      <w:r>
-        <w:rPr>
-          <w:sz w:val="28"/>
-          <w:szCs w:val="28"/>
-          <w:lang w:val="en-US"/>
-        </w:rPr>
-        <w:t>=</w:t>
-      </w:r>
-      <w:proofErr w:type="spellStart"/>
-      <w:r>
-        <w:rPr>
-          <w:sz w:val="28"/>
-          <w:szCs w:val="28"/>
-          <w:lang w:val="en-US"/>
-        </w:rPr>
-        <w:t>library_mvc;charset</w:t>
-      </w:r>
-      <w:proofErr w:type="spellEnd"/>
-      <w:r>
-        <w:rPr>
-          <w:sz w:val="28"/>
-          <w:szCs w:val="28"/>
-          <w:lang w:val="en-US"/>
-        </w:rPr>
-        <w:t>=utf8", "root", "");</w:t>
+        <w:t xml:space="preserve">        $this-&gt;pdo = new PDO("mysql:host=localhost;dbname=library_mvc;charset=utf8", "root", "");</w:t>
       </w:r>
       <w:r>
         <w:rPr>
@@ -4520,25 +3056,7 @@
           <w:lang w:val="en-US"/>
         </w:rPr>
         <w:br/>
-        <w:t xml:space="preserve">    public function </w:t>
-      </w:r>
-      <w:proofErr w:type="spellStart"/>
-      <w:r>
-        <w:rPr>
-          <w:sz w:val="28"/>
-          <w:szCs w:val="28"/>
-          <w:lang w:val="en-US"/>
-        </w:rPr>
-        <w:t>findBooks</w:t>
-      </w:r>
-      <w:proofErr w:type="spellEnd"/>
-      <w:r>
-        <w:rPr>
-          <w:sz w:val="28"/>
-          <w:szCs w:val="28"/>
-          <w:lang w:val="en-US"/>
-        </w:rPr>
-        <w:t>($search = '') {</w:t>
+        <w:t xml:space="preserve">    public function findBooks($search = '') {</w:t>
       </w:r>
       <w:r>
         <w:rPr>
@@ -4556,133 +3074,25 @@
           <w:lang w:val="en-US"/>
         </w:rPr>
         <w:br/>
-        <w:t xml:space="preserve">            $</w:t>
-      </w:r>
-      <w:proofErr w:type="spellStart"/>
-      <w:r>
-        <w:rPr>
-          <w:sz w:val="28"/>
-          <w:szCs w:val="28"/>
-          <w:lang w:val="en-US"/>
-        </w:rPr>
-        <w:t>sql</w:t>
-      </w:r>
-      <w:proofErr w:type="spellEnd"/>
-      <w:r>
-        <w:rPr>
-          <w:sz w:val="28"/>
-          <w:szCs w:val="28"/>
-          <w:lang w:val="en-US"/>
-        </w:rPr>
-        <w:t xml:space="preserve"> = "SELECT books.*, </w:t>
-      </w:r>
-      <w:proofErr w:type="spellStart"/>
-      <w:r>
-        <w:rPr>
-          <w:sz w:val="28"/>
-          <w:szCs w:val="28"/>
-          <w:lang w:val="en-US"/>
-        </w:rPr>
-        <w:t>author.surname</w:t>
-      </w:r>
-      <w:proofErr w:type="spellEnd"/>
-      <w:r>
-        <w:rPr>
-          <w:sz w:val="28"/>
-          <w:szCs w:val="28"/>
-          <w:lang w:val="en-US"/>
-        </w:rPr>
-        <w:t xml:space="preserve">, author.name FROM books </w:t>
-      </w:r>
-      <w:r>
-        <w:rPr>
-          <w:sz w:val="28"/>
-          <w:szCs w:val="28"/>
-          <w:lang w:val="en-US"/>
-        </w:rPr>
-        <w:br/>
-        <w:t xml:space="preserve">                    JOIN author ON </w:t>
-      </w:r>
-      <w:proofErr w:type="spellStart"/>
-      <w:r>
-        <w:rPr>
-          <w:sz w:val="28"/>
-          <w:szCs w:val="28"/>
-          <w:lang w:val="en-US"/>
-        </w:rPr>
-        <w:t>books.author_id</w:t>
-      </w:r>
-      <w:proofErr w:type="spellEnd"/>
-      <w:r>
-        <w:rPr>
-          <w:sz w:val="28"/>
-          <w:szCs w:val="28"/>
-          <w:lang w:val="en-US"/>
-        </w:rPr>
-        <w:t xml:space="preserve"> = author.id";</w:t>
-      </w:r>
-      <w:r>
-        <w:rPr>
-          <w:sz w:val="28"/>
-          <w:szCs w:val="28"/>
-          <w:lang w:val="en-US"/>
-        </w:rPr>
-        <w:br/>
-        <w:t xml:space="preserve">            return $this-&gt;</w:t>
-      </w:r>
-      <w:proofErr w:type="spellStart"/>
-      <w:r>
-        <w:rPr>
-          <w:sz w:val="28"/>
-          <w:szCs w:val="28"/>
-          <w:lang w:val="en-US"/>
-        </w:rPr>
-        <w:t>pdo</w:t>
-      </w:r>
-      <w:proofErr w:type="spellEnd"/>
-      <w:r>
-        <w:rPr>
-          <w:sz w:val="28"/>
-          <w:szCs w:val="28"/>
-          <w:lang w:val="en-US"/>
-        </w:rPr>
-        <w:t>-&gt;query($</w:t>
-      </w:r>
-      <w:proofErr w:type="spellStart"/>
-      <w:r>
-        <w:rPr>
-          <w:sz w:val="28"/>
-          <w:szCs w:val="28"/>
-          <w:lang w:val="en-US"/>
-        </w:rPr>
-        <w:t>sql</w:t>
-      </w:r>
-      <w:proofErr w:type="spellEnd"/>
-      <w:r>
-        <w:rPr>
-          <w:sz w:val="28"/>
-          <w:szCs w:val="28"/>
-          <w:lang w:val="en-US"/>
-        </w:rPr>
-        <w:t>)-&gt;</w:t>
-      </w:r>
-      <w:proofErr w:type="spellStart"/>
-      <w:r>
-        <w:rPr>
-          <w:sz w:val="28"/>
-          <w:szCs w:val="28"/>
-          <w:lang w:val="en-US"/>
-        </w:rPr>
-        <w:t>fetchAll</w:t>
-      </w:r>
-      <w:proofErr w:type="spellEnd"/>
-      <w:r>
-        <w:rPr>
-          <w:sz w:val="28"/>
-          <w:szCs w:val="28"/>
-          <w:lang w:val="en-US"/>
-        </w:rPr>
-        <w:t>(PDO::</w:t>
+        <w:t xml:space="preserve">            $sql = "SELECT books.*, author.surname, author.name FROM books </w:t>
+      </w:r>
+      <w:r>
+        <w:rPr>
+          <w:sz w:val="28"/>
+          <w:szCs w:val="28"/>
+          <w:lang w:val="en-US"/>
+        </w:rPr>
+        <w:br/>
+        <w:t xml:space="preserve">                    JOIN author ON books.author_id = author.id";</w:t>
+      </w:r>
+      <w:r>
+        <w:rPr>
+          <w:sz w:val="28"/>
+          <w:szCs w:val="28"/>
+          <w:lang w:val="en-US"/>
+        </w:rPr>
+        <w:br/>
+        <w:t xml:space="preserve">            return $this-&gt;pdo-&gt;query($sql)-&gt;fetchAll(PDO::</w:t>
       </w:r>
       <w:r>
         <w:rPr>
@@ -4718,250 +3128,52 @@
           <w:lang w:val="en-US"/>
         </w:rPr>
         <w:br/>
-        <w:t xml:space="preserve">            $</w:t>
-      </w:r>
-      <w:proofErr w:type="spellStart"/>
-      <w:r>
-        <w:rPr>
-          <w:sz w:val="28"/>
-          <w:szCs w:val="28"/>
-          <w:lang w:val="en-US"/>
-        </w:rPr>
-        <w:t>sql</w:t>
-      </w:r>
-      <w:proofErr w:type="spellEnd"/>
-      <w:r>
-        <w:rPr>
-          <w:sz w:val="28"/>
-          <w:szCs w:val="28"/>
-          <w:lang w:val="en-US"/>
-        </w:rPr>
-        <w:t xml:space="preserve"> = "SELECT books.*, </w:t>
-      </w:r>
-      <w:proofErr w:type="spellStart"/>
-      <w:r>
-        <w:rPr>
-          <w:sz w:val="28"/>
-          <w:szCs w:val="28"/>
-          <w:lang w:val="en-US"/>
-        </w:rPr>
-        <w:t>author.surname</w:t>
-      </w:r>
-      <w:proofErr w:type="spellEnd"/>
-      <w:r>
-        <w:rPr>
-          <w:sz w:val="28"/>
-          <w:szCs w:val="28"/>
-          <w:lang w:val="en-US"/>
-        </w:rPr>
-        <w:t xml:space="preserve">, author.name FROM books </w:t>
-      </w:r>
-      <w:r>
-        <w:rPr>
-          <w:sz w:val="28"/>
-          <w:szCs w:val="28"/>
-          <w:lang w:val="en-US"/>
-        </w:rPr>
-        <w:br/>
-        <w:t xml:space="preserve">                    JOIN author ON </w:t>
-      </w:r>
-      <w:proofErr w:type="spellStart"/>
-      <w:r>
-        <w:rPr>
-          <w:sz w:val="28"/>
-          <w:szCs w:val="28"/>
-          <w:lang w:val="en-US"/>
-        </w:rPr>
-        <w:t>books.author_id</w:t>
-      </w:r>
-      <w:proofErr w:type="spellEnd"/>
-      <w:r>
-        <w:rPr>
-          <w:sz w:val="28"/>
-          <w:szCs w:val="28"/>
-          <w:lang w:val="en-US"/>
-        </w:rPr>
-        <w:t xml:space="preserve"> = author.id </w:t>
-      </w:r>
-      <w:r>
-        <w:rPr>
-          <w:sz w:val="28"/>
-          <w:szCs w:val="28"/>
-          <w:lang w:val="en-US"/>
-        </w:rPr>
-        <w:br/>
-        <w:t xml:space="preserve">                    WHERE </w:t>
-      </w:r>
-      <w:proofErr w:type="spellStart"/>
-      <w:r>
-        <w:rPr>
-          <w:sz w:val="28"/>
-          <w:szCs w:val="28"/>
-          <w:lang w:val="en-US"/>
-        </w:rPr>
-        <w:t>books.title</w:t>
-      </w:r>
-      <w:proofErr w:type="spellEnd"/>
-      <w:r>
-        <w:rPr>
-          <w:sz w:val="28"/>
-          <w:szCs w:val="28"/>
-          <w:lang w:val="en-US"/>
-        </w:rPr>
-        <w:t xml:space="preserve"> LIKE :s OR </w:t>
-      </w:r>
-      <w:proofErr w:type="spellStart"/>
-      <w:r>
-        <w:rPr>
-          <w:sz w:val="28"/>
-          <w:szCs w:val="28"/>
-          <w:lang w:val="en-US"/>
-        </w:rPr>
-        <w:t>author.surname</w:t>
-      </w:r>
-      <w:proofErr w:type="spellEnd"/>
-      <w:r>
-        <w:rPr>
-          <w:sz w:val="28"/>
-          <w:szCs w:val="28"/>
-          <w:lang w:val="en-US"/>
-        </w:rPr>
-        <w:t xml:space="preserve"> LIKE :s";</w:t>
-      </w:r>
-      <w:r>
-        <w:rPr>
-          <w:sz w:val="28"/>
-          <w:szCs w:val="28"/>
-          <w:lang w:val="en-US"/>
-        </w:rPr>
-        <w:br/>
-        <w:t xml:space="preserve">            $</w:t>
-      </w:r>
-      <w:proofErr w:type="spellStart"/>
-      <w:r>
-        <w:rPr>
-          <w:sz w:val="28"/>
-          <w:szCs w:val="28"/>
-          <w:lang w:val="en-US"/>
-        </w:rPr>
-        <w:t>stmt</w:t>
-      </w:r>
-      <w:proofErr w:type="spellEnd"/>
-      <w:r>
-        <w:rPr>
-          <w:sz w:val="28"/>
-          <w:szCs w:val="28"/>
-          <w:lang w:val="en-US"/>
-        </w:rPr>
-        <w:t xml:space="preserve"> = $this-&gt;</w:t>
-      </w:r>
-      <w:proofErr w:type="spellStart"/>
-      <w:r>
-        <w:rPr>
-          <w:sz w:val="28"/>
-          <w:szCs w:val="28"/>
-          <w:lang w:val="en-US"/>
-        </w:rPr>
-        <w:t>pdo</w:t>
-      </w:r>
-      <w:proofErr w:type="spellEnd"/>
-      <w:r>
-        <w:rPr>
-          <w:sz w:val="28"/>
-          <w:szCs w:val="28"/>
-          <w:lang w:val="en-US"/>
-        </w:rPr>
-        <w:t>-&gt;prepare($</w:t>
-      </w:r>
-      <w:proofErr w:type="spellStart"/>
-      <w:r>
-        <w:rPr>
-          <w:sz w:val="28"/>
-          <w:szCs w:val="28"/>
-          <w:lang w:val="en-US"/>
-        </w:rPr>
-        <w:t>sql</w:t>
-      </w:r>
-      <w:proofErr w:type="spellEnd"/>
-      <w:r>
-        <w:rPr>
-          <w:sz w:val="28"/>
-          <w:szCs w:val="28"/>
-          <w:lang w:val="en-US"/>
-        </w:rPr>
-        <w:t>);</w:t>
-      </w:r>
-      <w:r>
-        <w:rPr>
-          <w:sz w:val="28"/>
-          <w:szCs w:val="28"/>
-          <w:lang w:val="en-US"/>
-        </w:rPr>
-        <w:br/>
-        <w:t xml:space="preserve">            $</w:t>
-      </w:r>
-      <w:proofErr w:type="spellStart"/>
-      <w:r>
-        <w:rPr>
-          <w:sz w:val="28"/>
-          <w:szCs w:val="28"/>
-          <w:lang w:val="en-US"/>
-        </w:rPr>
-        <w:t>stmt</w:t>
-      </w:r>
-      <w:proofErr w:type="spellEnd"/>
-      <w:r>
-        <w:rPr>
-          <w:sz w:val="28"/>
-          <w:szCs w:val="28"/>
-          <w:lang w:val="en-US"/>
-        </w:rPr>
-        <w:t>-&gt;execute(['s' =&gt; "%$search%"]);</w:t>
-      </w:r>
-      <w:r>
-        <w:rPr>
-          <w:sz w:val="28"/>
-          <w:szCs w:val="28"/>
-          <w:lang w:val="en-US"/>
-        </w:rPr>
-        <w:br/>
-        <w:t xml:space="preserve">            return $</w:t>
-      </w:r>
-      <w:proofErr w:type="spellStart"/>
-      <w:r>
-        <w:rPr>
-          <w:sz w:val="28"/>
-          <w:szCs w:val="28"/>
-          <w:lang w:val="en-US"/>
-        </w:rPr>
-        <w:t>stmt</w:t>
-      </w:r>
-      <w:proofErr w:type="spellEnd"/>
-      <w:r>
-        <w:rPr>
-          <w:sz w:val="28"/>
-          <w:szCs w:val="28"/>
-          <w:lang w:val="en-US"/>
-        </w:rPr>
-        <w:t>-&gt;</w:t>
-      </w:r>
-      <w:proofErr w:type="spellStart"/>
-      <w:r>
-        <w:rPr>
-          <w:sz w:val="28"/>
-          <w:szCs w:val="28"/>
-          <w:lang w:val="en-US"/>
-        </w:rPr>
-        <w:t>fetchAll</w:t>
-      </w:r>
-      <w:proofErr w:type="spellEnd"/>
-      <w:r>
-        <w:rPr>
-          <w:sz w:val="28"/>
-          <w:szCs w:val="28"/>
-          <w:lang w:val="en-US"/>
-        </w:rPr>
-        <w:t>(PDO::</w:t>
+        <w:t xml:space="preserve">            $sql = "SELECT books.*, author.surname, author.name FROM books </w:t>
+      </w:r>
+      <w:r>
+        <w:rPr>
+          <w:sz w:val="28"/>
+          <w:szCs w:val="28"/>
+          <w:lang w:val="en-US"/>
+        </w:rPr>
+        <w:br/>
+        <w:t xml:space="preserve">                    JOIN author ON books.author_id = author.id </w:t>
+      </w:r>
+      <w:r>
+        <w:rPr>
+          <w:sz w:val="28"/>
+          <w:szCs w:val="28"/>
+          <w:lang w:val="en-US"/>
+        </w:rPr>
+        <w:br/>
+        <w:t xml:space="preserve">                    WHERE books.title LIKE :s OR author.surname LIKE :s";</w:t>
+      </w:r>
+      <w:r>
+        <w:rPr>
+          <w:sz w:val="28"/>
+          <w:szCs w:val="28"/>
+          <w:lang w:val="en-US"/>
+        </w:rPr>
+        <w:br/>
+        <w:t xml:space="preserve">            $stmt = $this-&gt;pdo-&gt;prepare($sql);</w:t>
+      </w:r>
+      <w:r>
+        <w:rPr>
+          <w:sz w:val="28"/>
+          <w:szCs w:val="28"/>
+          <w:lang w:val="en-US"/>
+        </w:rPr>
+        <w:br/>
+        <w:t xml:space="preserve">            $stmt-&gt;execute(['s' =&gt; "%$search%"]);</w:t>
+      </w:r>
+      <w:r>
+        <w:rPr>
+          <w:sz w:val="28"/>
+          <w:szCs w:val="28"/>
+          <w:lang w:val="en-US"/>
+        </w:rPr>
+        <w:br/>
+        <w:t xml:space="preserve">            return $stmt-&gt;fetchAll(PDO::</w:t>
       </w:r>
       <w:r>
         <w:rPr>
@@ -5050,7 +3262,6 @@
         </w:rPr>
         <w:t xml:space="preserve">Програмний код ФАЙЛ </w:t>
       </w:r>
-      <w:proofErr w:type="spellStart"/>
       <w:r>
         <w:rPr>
           <w:b/>
@@ -5061,7 +3272,6 @@
         </w:rPr>
         <w:t>list.php</w:t>
       </w:r>
-      <w:proofErr w:type="spellEnd"/>
     </w:p>
     <w:p>
       <w:pPr>
@@ -5115,25 +3325,7 @@
           <w:lang w:val="en-US"/>
         </w:rPr>
         <w:br/>
-        <w:t>&lt;form action="</w:t>
-      </w:r>
-      <w:proofErr w:type="spellStart"/>
-      <w:r>
-        <w:rPr>
-          <w:sz w:val="28"/>
-          <w:szCs w:val="28"/>
-          <w:lang w:val="en-US"/>
-        </w:rPr>
-        <w:t>index.php</w:t>
-      </w:r>
-      <w:proofErr w:type="spellEnd"/>
-      <w:r>
-        <w:rPr>
-          <w:sz w:val="28"/>
-          <w:szCs w:val="28"/>
-          <w:lang w:val="en-US"/>
-        </w:rPr>
-        <w:t>" method="GET"&gt;</w:t>
+        <w:t>&lt;form action="index.php" method="GET"&gt;</w:t>
       </w:r>
       <w:r>
         <w:rPr>
@@ -5203,178 +3395,34 @@
           <w:lang w:val="en-US"/>
         </w:rPr>
         <w:lastRenderedPageBreak/>
-        <w:t xml:space="preserve">        &lt;</w:t>
-      </w:r>
-      <w:proofErr w:type="spellStart"/>
-      <w:r>
-        <w:rPr>
-          <w:sz w:val="28"/>
-          <w:szCs w:val="28"/>
-          <w:lang w:val="en-US"/>
-        </w:rPr>
-        <w:t>th</w:t>
-      </w:r>
-      <w:proofErr w:type="spellEnd"/>
-      <w:r>
-        <w:rPr>
-          <w:sz w:val="28"/>
-          <w:szCs w:val="28"/>
-          <w:lang w:val="en-US"/>
-        </w:rPr>
-        <w:t>&gt;Title&lt;/</w:t>
-      </w:r>
-      <w:proofErr w:type="spellStart"/>
-      <w:r>
-        <w:rPr>
-          <w:sz w:val="28"/>
-          <w:szCs w:val="28"/>
-          <w:lang w:val="en-US"/>
-        </w:rPr>
-        <w:t>th</w:t>
-      </w:r>
-      <w:proofErr w:type="spellEnd"/>
-      <w:r>
-        <w:rPr>
-          <w:sz w:val="28"/>
-          <w:szCs w:val="28"/>
-          <w:lang w:val="en-US"/>
-        </w:rPr>
-        <w:t>&gt;</w:t>
-      </w:r>
-      <w:r>
-        <w:rPr>
-          <w:sz w:val="28"/>
-          <w:szCs w:val="28"/>
-          <w:lang w:val="en-US"/>
-        </w:rPr>
-        <w:br/>
-        <w:t xml:space="preserve">        &lt;</w:t>
-      </w:r>
-      <w:proofErr w:type="spellStart"/>
-      <w:r>
-        <w:rPr>
-          <w:sz w:val="28"/>
-          <w:szCs w:val="28"/>
-          <w:lang w:val="en-US"/>
-        </w:rPr>
-        <w:t>th</w:t>
-      </w:r>
-      <w:proofErr w:type="spellEnd"/>
-      <w:r>
-        <w:rPr>
-          <w:sz w:val="28"/>
-          <w:szCs w:val="28"/>
-          <w:lang w:val="en-US"/>
-        </w:rPr>
-        <w:t>&gt;Description&lt;/</w:t>
-      </w:r>
-      <w:proofErr w:type="spellStart"/>
-      <w:r>
-        <w:rPr>
-          <w:sz w:val="28"/>
-          <w:szCs w:val="28"/>
-          <w:lang w:val="en-US"/>
-        </w:rPr>
-        <w:t>th</w:t>
-      </w:r>
-      <w:proofErr w:type="spellEnd"/>
-      <w:r>
-        <w:rPr>
-          <w:sz w:val="28"/>
-          <w:szCs w:val="28"/>
-          <w:lang w:val="en-US"/>
-        </w:rPr>
-        <w:t>&gt;</w:t>
-      </w:r>
-      <w:r>
-        <w:rPr>
-          <w:sz w:val="28"/>
-          <w:szCs w:val="28"/>
-          <w:lang w:val="en-US"/>
-        </w:rPr>
-        <w:br/>
-        <w:t xml:space="preserve">        &lt;</w:t>
-      </w:r>
-      <w:proofErr w:type="spellStart"/>
-      <w:r>
-        <w:rPr>
-          <w:sz w:val="28"/>
-          <w:szCs w:val="28"/>
-          <w:lang w:val="en-US"/>
-        </w:rPr>
-        <w:t>th</w:t>
-      </w:r>
-      <w:proofErr w:type="spellEnd"/>
-      <w:r>
-        <w:rPr>
-          <w:sz w:val="28"/>
-          <w:szCs w:val="28"/>
-          <w:lang w:val="en-US"/>
-        </w:rPr>
-        <w:t>&gt;Year&lt;/</w:t>
-      </w:r>
-      <w:proofErr w:type="spellStart"/>
-      <w:r>
-        <w:rPr>
-          <w:sz w:val="28"/>
-          <w:szCs w:val="28"/>
-          <w:lang w:val="en-US"/>
-        </w:rPr>
-        <w:t>th</w:t>
-      </w:r>
-      <w:proofErr w:type="spellEnd"/>
-      <w:r>
-        <w:rPr>
-          <w:sz w:val="28"/>
-          <w:szCs w:val="28"/>
-          <w:lang w:val="en-US"/>
-        </w:rPr>
-        <w:t>&gt;</w:t>
-      </w:r>
-      <w:r>
-        <w:rPr>
-          <w:sz w:val="28"/>
-          <w:szCs w:val="28"/>
-          <w:lang w:val="en-US"/>
-        </w:rPr>
-        <w:br/>
-        <w:t xml:space="preserve">        &lt;</w:t>
-      </w:r>
-      <w:proofErr w:type="spellStart"/>
-      <w:r>
-        <w:rPr>
-          <w:sz w:val="28"/>
-          <w:szCs w:val="28"/>
-          <w:lang w:val="en-US"/>
-        </w:rPr>
-        <w:t>th</w:t>
-      </w:r>
-      <w:proofErr w:type="spellEnd"/>
-      <w:r>
-        <w:rPr>
-          <w:sz w:val="28"/>
-          <w:szCs w:val="28"/>
-          <w:lang w:val="en-US"/>
-        </w:rPr>
-        <w:t>&gt;Author&lt;/</w:t>
-      </w:r>
-      <w:proofErr w:type="spellStart"/>
-      <w:r>
-        <w:rPr>
-          <w:sz w:val="28"/>
-          <w:szCs w:val="28"/>
-          <w:lang w:val="en-US"/>
-        </w:rPr>
-        <w:t>th</w:t>
-      </w:r>
-      <w:proofErr w:type="spellEnd"/>
-      <w:r>
-        <w:rPr>
-          <w:sz w:val="28"/>
-          <w:szCs w:val="28"/>
-          <w:lang w:val="en-US"/>
-        </w:rPr>
-        <w:t>&gt;</w:t>
+        <w:t xml:space="preserve">        &lt;th&gt;Title&lt;/th&gt;</w:t>
+      </w:r>
+      <w:r>
+        <w:rPr>
+          <w:sz w:val="28"/>
+          <w:szCs w:val="28"/>
+          <w:lang w:val="en-US"/>
+        </w:rPr>
+        <w:br/>
+        <w:t xml:space="preserve">        &lt;th&gt;Description&lt;/th&gt;</w:t>
+      </w:r>
+      <w:r>
+        <w:rPr>
+          <w:sz w:val="28"/>
+          <w:szCs w:val="28"/>
+          <w:lang w:val="en-US"/>
+        </w:rPr>
+        <w:br/>
+        <w:t xml:space="preserve">        &lt;th&gt;Year&lt;/th&gt;</w:t>
+      </w:r>
+      <w:r>
+        <w:rPr>
+          <w:sz w:val="28"/>
+          <w:szCs w:val="28"/>
+          <w:lang w:val="en-US"/>
+        </w:rPr>
+        <w:br/>
+        <w:t xml:space="preserve">        &lt;th&gt;Author&lt;/th&gt;</w:t>
       </w:r>
       <w:r>
         <w:rPr>
@@ -5392,25 +3440,7 @@
           <w:lang w:val="en-US"/>
         </w:rPr>
         <w:br/>
-        <w:t xml:space="preserve">    &lt;?</w:t>
-      </w:r>
-      <w:proofErr w:type="spellStart"/>
-      <w:r>
-        <w:rPr>
-          <w:sz w:val="28"/>
-          <w:szCs w:val="28"/>
-          <w:lang w:val="en-US"/>
-        </w:rPr>
-        <w:t>php</w:t>
-      </w:r>
-      <w:proofErr w:type="spellEnd"/>
-      <w:r>
-        <w:rPr>
-          <w:sz w:val="28"/>
-          <w:szCs w:val="28"/>
-          <w:lang w:val="en-US"/>
-        </w:rPr>
-        <w:t xml:space="preserve"> foreach ($books as $book): ?&gt;</w:t>
+        <w:t xml:space="preserve">    &lt;?php foreach ($books as $book): ?&gt;</w:t>
       </w:r>
       <w:r>
         <w:rPr>
@@ -5428,124 +3458,34 @@
           <w:lang w:val="en-US"/>
         </w:rPr>
         <w:br/>
-        <w:t xml:space="preserve">            &lt;td&gt;&lt;?= </w:t>
-      </w:r>
-      <w:proofErr w:type="spellStart"/>
-      <w:r>
-        <w:rPr>
-          <w:sz w:val="28"/>
-          <w:szCs w:val="28"/>
-          <w:lang w:val="en-US"/>
-        </w:rPr>
-        <w:t>htmlspecialchars</w:t>
-      </w:r>
-      <w:proofErr w:type="spellEnd"/>
-      <w:r>
-        <w:rPr>
-          <w:sz w:val="28"/>
-          <w:szCs w:val="28"/>
-          <w:lang w:val="en-US"/>
-        </w:rPr>
-        <w:t>($book['title']) ?&gt;&lt;/td&gt;</w:t>
-      </w:r>
-      <w:r>
-        <w:rPr>
-          <w:sz w:val="28"/>
-          <w:szCs w:val="28"/>
-          <w:lang w:val="en-US"/>
-        </w:rPr>
-        <w:br/>
-        <w:t xml:space="preserve">            &lt;td&gt;&lt;?= </w:t>
-      </w:r>
-      <w:proofErr w:type="spellStart"/>
-      <w:r>
-        <w:rPr>
-          <w:sz w:val="28"/>
-          <w:szCs w:val="28"/>
-          <w:lang w:val="en-US"/>
-        </w:rPr>
-        <w:t>htmlspecialchars</w:t>
-      </w:r>
-      <w:proofErr w:type="spellEnd"/>
-      <w:r>
-        <w:rPr>
-          <w:sz w:val="28"/>
-          <w:szCs w:val="28"/>
-          <w:lang w:val="en-US"/>
-        </w:rPr>
-        <w:t>($book['description']) ?&gt;&lt;/td&gt;</w:t>
-      </w:r>
-      <w:r>
-        <w:rPr>
-          <w:sz w:val="28"/>
-          <w:szCs w:val="28"/>
-          <w:lang w:val="en-US"/>
-        </w:rPr>
-        <w:br/>
-        <w:t xml:space="preserve">            &lt;td&gt;&lt;?= </w:t>
-      </w:r>
-      <w:proofErr w:type="spellStart"/>
-      <w:r>
-        <w:rPr>
-          <w:sz w:val="28"/>
-          <w:szCs w:val="28"/>
-          <w:lang w:val="en-US"/>
-        </w:rPr>
-        <w:t>htmlspecialchars</w:t>
-      </w:r>
-      <w:proofErr w:type="spellEnd"/>
-      <w:r>
-        <w:rPr>
-          <w:sz w:val="28"/>
-          <w:szCs w:val="28"/>
-          <w:lang w:val="en-US"/>
-        </w:rPr>
-        <w:t>($book['year']) ?&gt;&lt;/td&gt;</w:t>
-      </w:r>
-      <w:r>
-        <w:rPr>
-          <w:sz w:val="28"/>
-          <w:szCs w:val="28"/>
-          <w:lang w:val="en-US"/>
-        </w:rPr>
-        <w:br/>
-        <w:t xml:space="preserve">            &lt;td&gt;&lt;?= </w:t>
-      </w:r>
-      <w:proofErr w:type="spellStart"/>
-      <w:r>
-        <w:rPr>
-          <w:sz w:val="28"/>
-          <w:szCs w:val="28"/>
-          <w:lang w:val="en-US"/>
-        </w:rPr>
-        <w:t>htmlspecialchars</w:t>
-      </w:r>
-      <w:proofErr w:type="spellEnd"/>
-      <w:r>
-        <w:rPr>
-          <w:sz w:val="28"/>
-          <w:szCs w:val="28"/>
-          <w:lang w:val="en-US"/>
-        </w:rPr>
-        <w:t>($book['name'] . " " . $book['surname']</w:t>
-      </w:r>
-      <w:proofErr w:type="gramStart"/>
-      <w:r>
-        <w:rPr>
-          <w:sz w:val="28"/>
-          <w:szCs w:val="28"/>
-          <w:lang w:val="en-US"/>
-        </w:rPr>
-        <w:t>) ?</w:t>
-      </w:r>
-      <w:proofErr w:type="gramEnd"/>
-      <w:r>
-        <w:rPr>
-          <w:sz w:val="28"/>
-          <w:szCs w:val="28"/>
-          <w:lang w:val="en-US"/>
-        </w:rPr>
-        <w:t>&gt;&lt;/td&gt;</w:t>
+        <w:t xml:space="preserve">            &lt;td&gt;&lt;?= htmlspecialchars($book['title']) ?&gt;&lt;/td&gt;</w:t>
+      </w:r>
+      <w:r>
+        <w:rPr>
+          <w:sz w:val="28"/>
+          <w:szCs w:val="28"/>
+          <w:lang w:val="en-US"/>
+        </w:rPr>
+        <w:br/>
+        <w:t xml:space="preserve">            &lt;td&gt;&lt;?= htmlspecialchars($book['description']) ?&gt;&lt;/td&gt;</w:t>
+      </w:r>
+      <w:r>
+        <w:rPr>
+          <w:sz w:val="28"/>
+          <w:szCs w:val="28"/>
+          <w:lang w:val="en-US"/>
+        </w:rPr>
+        <w:br/>
+        <w:t xml:space="preserve">            &lt;td&gt;&lt;?= htmlspecialchars($book['year']) ?&gt;&lt;/td&gt;</w:t>
+      </w:r>
+      <w:r>
+        <w:rPr>
+          <w:sz w:val="28"/>
+          <w:szCs w:val="28"/>
+          <w:lang w:val="en-US"/>
+        </w:rPr>
+        <w:br/>
+        <w:t xml:space="preserve">            &lt;td&gt;&lt;?= htmlspecialchars($book['name'] . " " . $book['surname']) ?&gt;&lt;/td&gt;</w:t>
       </w:r>
       <w:r>
         <w:rPr>
@@ -5563,53 +3503,7 @@
           <w:lang w:val="en-US"/>
         </w:rPr>
         <w:br/>
-        <w:t xml:space="preserve">    &lt;?</w:t>
-      </w:r>
-      <w:proofErr w:type="spellStart"/>
-      <w:r>
-        <w:rPr>
-          <w:sz w:val="28"/>
-          <w:szCs w:val="28"/>
-          <w:lang w:val="en-US"/>
-        </w:rPr>
-        <w:t>php</w:t>
-      </w:r>
-      <w:proofErr w:type="spellEnd"/>
-      <w:r>
-        <w:rPr>
-          <w:sz w:val="28"/>
-          <w:szCs w:val="28"/>
-          <w:lang w:val="en-US"/>
-        </w:rPr>
-        <w:t xml:space="preserve"> </w:t>
-      </w:r>
-      <w:proofErr w:type="spellStart"/>
-      <w:r>
-        <w:rPr>
-          <w:sz w:val="28"/>
-          <w:szCs w:val="28"/>
-          <w:lang w:val="en-US"/>
-        </w:rPr>
-        <w:t>endforeach</w:t>
-      </w:r>
-      <w:proofErr w:type="spellEnd"/>
-      <w:proofErr w:type="gramStart"/>
-      <w:r>
-        <w:rPr>
-          <w:sz w:val="28"/>
-          <w:szCs w:val="28"/>
-          <w:lang w:val="en-US"/>
-        </w:rPr>
-        <w:t>; ?</w:t>
-      </w:r>
-      <w:proofErr w:type="gramEnd"/>
-      <w:r>
-        <w:rPr>
-          <w:sz w:val="28"/>
-          <w:szCs w:val="28"/>
-          <w:lang w:val="en-US"/>
-        </w:rPr>
-        <w:t>&gt;</w:t>
+        <w:t xml:space="preserve">    &lt;?php endforeach; ?&gt;</w:t>
       </w:r>
       <w:r>
         <w:rPr>
@@ -5671,7 +3565,6 @@
         </w:rPr>
         <w:t xml:space="preserve">Програмний код ФАЙЛ </w:t>
       </w:r>
-      <w:proofErr w:type="spellStart"/>
       <w:r>
         <w:rPr>
           <w:b/>
@@ -5682,7 +3575,6 @@
         </w:rPr>
         <w:t>index.php</w:t>
       </w:r>
-      <w:proofErr w:type="spellEnd"/>
     </w:p>
     <w:p>
       <w:pPr>
@@ -5700,61 +3592,16 @@
           <w:szCs w:val="28"/>
           <w:lang w:val="en-US"/>
         </w:rPr>
-        <w:t>&lt;?</w:t>
-      </w:r>
-      <w:proofErr w:type="spellStart"/>
-      <w:r>
-        <w:rPr>
-          <w:sz w:val="28"/>
-          <w:szCs w:val="28"/>
-          <w:lang w:val="en-US"/>
-        </w:rPr>
-        <w:t>php</w:t>
-      </w:r>
-      <w:proofErr w:type="spellEnd"/>
-      <w:r>
-        <w:rPr>
-          <w:sz w:val="28"/>
-          <w:szCs w:val="28"/>
-          <w:lang w:val="en-US"/>
-        </w:rPr>
-        <w:br/>
-      </w:r>
-      <w:proofErr w:type="spellStart"/>
-      <w:r>
-        <w:rPr>
-          <w:sz w:val="28"/>
-          <w:szCs w:val="28"/>
-          <w:lang w:val="en-US"/>
-        </w:rPr>
-        <w:t>include_once</w:t>
-      </w:r>
-      <w:proofErr w:type="spellEnd"/>
-      <w:r>
-        <w:rPr>
-          <w:sz w:val="28"/>
-          <w:szCs w:val="28"/>
-          <w:lang w:val="en-US"/>
-        </w:rPr>
-        <w:t>("controller/</w:t>
-      </w:r>
-      <w:proofErr w:type="spellStart"/>
-      <w:r>
-        <w:rPr>
-          <w:sz w:val="28"/>
-          <w:szCs w:val="28"/>
-          <w:lang w:val="en-US"/>
-        </w:rPr>
-        <w:t>Controller.php</w:t>
-      </w:r>
-      <w:proofErr w:type="spellEnd"/>
-      <w:r>
-        <w:rPr>
-          <w:sz w:val="28"/>
-          <w:szCs w:val="28"/>
-          <w:lang w:val="en-US"/>
-        </w:rPr>
-        <w:t>");</w:t>
+        <w:t>&lt;?php</w:t>
+      </w:r>
+      <w:r>
+        <w:rPr>
+          <w:sz w:val="28"/>
+          <w:szCs w:val="28"/>
+          <w:lang w:val="en-US"/>
+        </w:rPr>
+        <w:br/>
+        <w:t>include_once("controller/Controller.php");</w:t>
       </w:r>
       <w:r>
         <w:rPr>
@@ -5780,24 +3627,159 @@
           <w:lang w:val="en-US"/>
         </w:rPr>
         <w:br/>
-        <w:t>$controller-&gt;</w:t>
-      </w:r>
-      <w:proofErr w:type="gramStart"/>
-      <w:r>
-        <w:rPr>
-          <w:sz w:val="28"/>
-          <w:szCs w:val="28"/>
-          <w:lang w:val="en-US"/>
-        </w:rPr>
-        <w:t>invoke(</w:t>
-      </w:r>
-      <w:proofErr w:type="gramEnd"/>
-      <w:r>
-        <w:rPr>
-          <w:sz w:val="28"/>
-          <w:szCs w:val="28"/>
-          <w:lang w:val="en-US"/>
-        </w:rPr>
+        <w:t>$controller-&gt;invoke();</w:t>
+      </w:r>
+      <w:r>
+        <w:rPr>
+          <w:sz w:val="28"/>
+          <w:szCs w:val="28"/>
+          <w:lang w:val="en-US"/>
+        </w:rPr>
+        <w:br/>
+        <w:t>?&gt;</w:t>
+      </w:r>
+    </w:p>
+    <w:p>
+      <w:pPr>
+        <w:ind w:firstLine="0"/>
+        <w:jc w:val="left"/>
+        <w:rPr>
+          <w:sz w:val="28"/>
+          <w:szCs w:val="28"/>
+          <w:lang w:val="en-US"/>
+        </w:rPr>
+      </w:pPr>
+    </w:p>
+    <w:p>
+      <w:pPr>
+        <w:ind w:firstLine="0"/>
+        <w:rPr>
+          <w:b/>
+          <w:bCs/>
+          <w:sz w:val="28"/>
+          <w:szCs w:val="28"/>
+          <w:lang w:val="en-US"/>
+        </w:rPr>
+      </w:pPr>
+      <w:r>
+        <w:rPr>
+          <w:b/>
+          <w:bCs/>
+          <w:sz w:val="28"/>
+          <w:szCs w:val="28"/>
+          <w:lang w:val="uk-UA"/>
+        </w:rPr>
+        <w:t xml:space="preserve">Програмний код </w:t>
+      </w:r>
+      <w:r>
+        <w:rPr>
+          <w:b/>
+          <w:bCs/>
+          <w:sz w:val="28"/>
+          <w:szCs w:val="28"/>
+          <w:lang w:val="en-US"/>
+        </w:rPr>
+        <w:t>MY_SQL</w:t>
+      </w:r>
+    </w:p>
+    <w:p>
+      <w:pPr>
+        <w:ind w:firstLine="0"/>
+        <w:jc w:val="left"/>
+        <w:rPr>
+          <w:sz w:val="28"/>
+          <w:szCs w:val="28"/>
+          <w:lang w:val="en-US"/>
+        </w:rPr>
+      </w:pPr>
+    </w:p>
+    <w:p>
+      <w:pPr>
+        <w:ind w:firstLine="0"/>
+        <w:jc w:val="left"/>
+        <w:rPr>
+          <w:sz w:val="28"/>
+          <w:szCs w:val="28"/>
+          <w:lang w:val="en-US"/>
+        </w:rPr>
+      </w:pPr>
+      <w:r>
+        <w:rPr>
+          <w:sz w:val="28"/>
+          <w:szCs w:val="28"/>
+          <w:lang w:val="en-US"/>
+        </w:rPr>
+        <w:t>CREATE DATABASE IF NOT EXISTS library_mvc;</w:t>
+      </w:r>
+      <w:r>
+        <w:rPr>
+          <w:sz w:val="28"/>
+          <w:szCs w:val="28"/>
+          <w:lang w:val="en-US"/>
+        </w:rPr>
+        <w:br/>
+        <w:t>USE library_mvc;</w:t>
+      </w:r>
+      <w:r>
+        <w:rPr>
+          <w:sz w:val="28"/>
+          <w:szCs w:val="28"/>
+          <w:lang w:val="en-US"/>
+        </w:rPr>
+        <w:br/>
+      </w:r>
+      <w:r>
+        <w:rPr>
+          <w:sz w:val="28"/>
+          <w:szCs w:val="28"/>
+          <w:lang w:val="en-US"/>
+        </w:rPr>
+        <w:br/>
+        <w:t>CREATE TABLE IF NOT EXISTS author (</w:t>
+      </w:r>
+      <w:r>
+        <w:rPr>
+          <w:sz w:val="28"/>
+          <w:szCs w:val="28"/>
+          <w:lang w:val="en-US"/>
+        </w:rPr>
+        <w:br/>
+        <w:t xml:space="preserve">    id INT AUTO_INCREMENT PRIMARY KEY,</w:t>
+      </w:r>
+      <w:r>
+        <w:rPr>
+          <w:sz w:val="28"/>
+          <w:szCs w:val="28"/>
+          <w:lang w:val="en-US"/>
+        </w:rPr>
+        <w:br/>
+        <w:t xml:space="preserve">    surname VARCHAR(255),</w:t>
+      </w:r>
+      <w:r>
+        <w:rPr>
+          <w:sz w:val="28"/>
+          <w:szCs w:val="28"/>
+          <w:lang w:val="en-US"/>
+        </w:rPr>
+        <w:br/>
+        <w:t xml:space="preserve">    name VARCHAR(255),</w:t>
+      </w:r>
+      <w:r>
+        <w:rPr>
+          <w:sz w:val="28"/>
+          <w:szCs w:val="28"/>
+          <w:lang w:val="en-US"/>
+        </w:rPr>
+        <w:br/>
+        <w:t xml:space="preserve">    country VARCHAR(255)</w:t>
+      </w:r>
+      <w:r>
+        <w:rPr>
+          <w:sz w:val="28"/>
+          <w:szCs w:val="28"/>
+          <w:lang w:val="en-US"/>
+        </w:rPr>
+        <w:br/>
         <w:t>);</w:t>
       </w:r>
       <w:r>
@@ -5807,7 +3789,183 @@
           <w:lang w:val="en-US"/>
         </w:rPr>
         <w:br/>
-        <w:t>?&gt;</w:t>
+      </w:r>
+      <w:r>
+        <w:rPr>
+          <w:sz w:val="28"/>
+          <w:szCs w:val="28"/>
+          <w:lang w:val="en-US"/>
+        </w:rPr>
+        <w:br/>
+        <w:t>CREATE TABLE IF NOT EXISTS books (</w:t>
+      </w:r>
+      <w:r>
+        <w:rPr>
+          <w:sz w:val="28"/>
+          <w:szCs w:val="28"/>
+          <w:lang w:val="en-US"/>
+        </w:rPr>
+        <w:br/>
+        <w:t xml:space="preserve">     id INT AUTO_INCREMENT PRIMARY KEY,</w:t>
+      </w:r>
+      <w:r>
+        <w:rPr>
+          <w:sz w:val="28"/>
+          <w:szCs w:val="28"/>
+          <w:lang w:val="en-US"/>
+        </w:rPr>
+        <w:br/>
+        <w:t xml:space="preserve">     title VARCHAR(255),</w:t>
+      </w:r>
+      <w:r>
+        <w:rPr>
+          <w:sz w:val="28"/>
+          <w:szCs w:val="28"/>
+          <w:lang w:val="en-US"/>
+        </w:rPr>
+        <w:br/>
+        <w:t xml:space="preserve">     description TEXT,</w:t>
+      </w:r>
+      <w:r>
+        <w:rPr>
+          <w:sz w:val="28"/>
+          <w:szCs w:val="28"/>
+          <w:lang w:val="en-US"/>
+        </w:rPr>
+        <w:br/>
+        <w:t xml:space="preserve">     year INT,</w:t>
+      </w:r>
+      <w:r>
+        <w:rPr>
+          <w:sz w:val="28"/>
+          <w:szCs w:val="28"/>
+          <w:lang w:val="en-US"/>
+        </w:rPr>
+        <w:br/>
+        <w:t xml:space="preserve">     pages INT,</w:t>
+      </w:r>
+      <w:r>
+        <w:rPr>
+          <w:sz w:val="28"/>
+          <w:szCs w:val="28"/>
+          <w:lang w:val="en-US"/>
+        </w:rPr>
+        <w:br/>
+        <w:t xml:space="preserve">     cover_photo VARCHAR(255),</w:t>
+      </w:r>
+      <w:r>
+        <w:rPr>
+          <w:sz w:val="28"/>
+          <w:szCs w:val="28"/>
+          <w:lang w:val="en-US"/>
+        </w:rPr>
+        <w:br/>
+        <w:t xml:space="preserve">     author_id INT,</w:t>
+      </w:r>
+      <w:r>
+        <w:rPr>
+          <w:sz w:val="28"/>
+          <w:szCs w:val="28"/>
+          <w:lang w:val="en-US"/>
+        </w:rPr>
+        <w:br/>
+      </w:r>
+      <w:r>
+        <w:rPr>
+          <w:sz w:val="28"/>
+          <w:szCs w:val="28"/>
+          <w:lang w:val="en-US"/>
+        </w:rPr>
+        <w:lastRenderedPageBreak/>
+        <w:t xml:space="preserve">     FOREIGN KEY (author_id) REFERENCES author(id)</w:t>
+      </w:r>
+      <w:r>
+        <w:rPr>
+          <w:sz w:val="28"/>
+          <w:szCs w:val="28"/>
+          <w:lang w:val="en-US"/>
+        </w:rPr>
+        <w:br/>
+        <w:t>);</w:t>
+      </w:r>
+      <w:r>
+        <w:rPr>
+          <w:sz w:val="28"/>
+          <w:szCs w:val="28"/>
+          <w:lang w:val="en-US"/>
+        </w:rPr>
+        <w:br/>
+      </w:r>
+      <w:r>
+        <w:rPr>
+          <w:sz w:val="28"/>
+          <w:szCs w:val="28"/>
+          <w:lang w:val="en-US"/>
+        </w:rPr>
+        <w:br/>
+        <w:t>-- Dummy data</w:t>
+      </w:r>
+      <w:r>
+        <w:rPr>
+          <w:sz w:val="28"/>
+          <w:szCs w:val="28"/>
+          <w:lang w:val="en-US"/>
+        </w:rPr>
+        <w:br/>
+        <w:t>INSERT INTO author (surname, name, country) VALUES</w:t>
+      </w:r>
+      <w:r>
+        <w:rPr>
+          <w:sz w:val="28"/>
+          <w:szCs w:val="28"/>
+          <w:lang w:val="en-US"/>
+        </w:rPr>
+        <w:br/>
+        <w:t>('Rowling', 'J.K.', 'UK'),</w:t>
+      </w:r>
+      <w:r>
+        <w:rPr>
+          <w:sz w:val="28"/>
+          <w:szCs w:val="28"/>
+          <w:lang w:val="en-US"/>
+        </w:rPr>
+        <w:br/>
+        <w:t>('Shevchenko', 'Taras', 'Ukraine');</w:t>
+      </w:r>
+      <w:r>
+        <w:rPr>
+          <w:sz w:val="28"/>
+          <w:szCs w:val="28"/>
+          <w:lang w:val="en-US"/>
+        </w:rPr>
+        <w:br/>
+      </w:r>
+      <w:r>
+        <w:rPr>
+          <w:sz w:val="28"/>
+          <w:szCs w:val="28"/>
+          <w:lang w:val="en-US"/>
+        </w:rPr>
+        <w:br/>
+        <w:t>INSERT INTO books (title, description, year, pages, author_id) VALUES</w:t>
+      </w:r>
+      <w:r>
+        <w:rPr>
+          <w:sz w:val="28"/>
+          <w:szCs w:val="28"/>
+          <w:lang w:val="en-US"/>
+        </w:rPr>
+        <w:br/>
+        <w:t>('Harry Potter', 'Wizard boy', 1997, 320, 1),</w:t>
+      </w:r>
+      <w:r>
+        <w:rPr>
+          <w:sz w:val="28"/>
+          <w:szCs w:val="28"/>
+          <w:lang w:val="en-US"/>
+        </w:rPr>
+        <w:br/>
+        <w:t>('Kobzar', 'Poems', 1840, 115, 2);</w:t>
       </w:r>
     </w:p>
     <w:p>

</xml_diff>